<commit_message>
docs: add cloud twin model, social features, and AIS comparison
Add comprehensive section on cloud redundancy architecture:
- Cloud twin model (same Docker image, --mode=boat vs --mode=cloud)
- What syncs vs stays local
- How this differs from AIS (range, data, privacy, history)
- Social features: Find My Crew, Who's on the Mooring, Rally mode
- Buddy system hosting, privacy model, real scenarios

Updated master report and docx.

Co-Authored-By: Claude Opus 4.6 (1M context) <noreply@anthropic.com>
</commit_message>
<xml_diff>
--- a/docs/report/above-deck-master-report.docx
+++ b/docs/report/above-deck-master-report.docx
@@ -15,7 +15,7 @@
         <w:pStyle w:val="Subtitle"/>
       </w:pPr>
       <w:r>
-        <w:t xml:space="preserve">Market Analysis · Technology Architecture · Hardware &amp; IoT · Product Vision</w:t>
+        <w:t xml:space="preserve">Market Analysis, Technology Architecture, Hardware &amp; IoT, Product Vision</w:t>
       </w:r>
     </w:p>
     <w:p>
@@ -43824,75 +43824,2495 @@
         </w:pict>
       </w:r>
     </w:p>
+    <w:p>
+      <w:r>
+        <w:pict>
+          <v:rect style="width:0;height:1.5pt" o:hralign="center" o:hrstd="t" o:hr="t"/>
+        </w:pict>
+      </w:r>
+    </w:p>
     <w:bookmarkEnd w:id="286"/>
     <w:bookmarkEnd w:id="287"/>
     <w:bookmarkEnd w:id="288"/>
-    <w:bookmarkStart w:id="289" w:name="appendix-a-can-bus-technology"/>
+    <w:bookmarkStart w:id="297" w:name="X739c05c7b5beab7ddb6267467463fbc9d90a8e3"/>
     <w:p>
       <w:pPr>
         <w:pStyle w:val="Heading1"/>
       </w:pPr>
       <w:r>
-        <w:t xml:space="preserve">Appendix A: CAN Bus Technology</w:t>
-      </w:r>
-    </w:p>
-    <w:bookmarkEnd w:id="289"/>
-    <w:bookmarkStart w:id="380" w:name="X6da4e0a24386a4425068bcf5ee7dd23241ff536"/>
-    <w:p>
-      <w:pPr>
-        <w:pStyle w:val="Heading1"/>
-      </w:pPr>
-      <w:r>
-        <w:t xml:space="preserve">CAN Bus Technology: From Automotive Origins to Marine, IoT, and Beyond</w:t>
+        <w:t xml:space="preserve">Part 5: Cloud Redundancy, Social Features &amp; AIS Comparison</w:t>
+      </w:r>
+    </w:p>
+    <w:bookmarkStart w:id="296" w:name="cloud-redundancy-social-features"/>
+    <w:p>
+      <w:pPr>
+        <w:pStyle w:val="Heading2"/>
+      </w:pPr>
+      <w:r>
+        <w:t xml:space="preserve">7. Cloud Redundancy &amp; Social Features</w:t>
+      </w:r>
+    </w:p>
+    <w:bookmarkStart w:id="289" w:name="the-cloud-twin-model"/>
+    <w:p>
+      <w:pPr>
+        <w:pStyle w:val="Heading3"/>
+      </w:pPr>
+      <w:r>
+        <w:t xml:space="preserve">7.1 The Cloud Twin Model</w:t>
       </w:r>
     </w:p>
     <w:p>
       <w:pPr>
         <w:pStyle w:val="FirstParagraph"/>
       </w:pPr>
+      <w:r>
+        <w:t xml:space="preserve">Every Above Deck boat deployment can optionally have a</w:t>
+      </w:r>
+      <w:r>
+        <w:t xml:space="preserve"> </w:t>
+      </w:r>
       <w:r>
         <w:rPr>
           <w:b/>
           <w:bCs/>
         </w:rPr>
-        <w:t xml:space="preserve">Date:</w:t>
-      </w:r>
-      <w:r>
-        <w:t xml:space="preserve"> </w:t>
-      </w:r>
-      <w:r>
-        <w:t xml:space="preserve">2026-03-20</w:t>
-      </w:r>
-      <w:r>
-        <w:t xml:space="preserve"> </w:t>
-      </w:r>
+        <w:t xml:space="preserve">cloud twin</w:t>
+      </w:r>
+      <w:r>
+        <w:t xml:space="preserve"> </w:t>
+      </w:r>
+      <w:r>
+        <w:t xml:space="preserve">— the same Docker image running on a VPS, home server, or NAS — that mirrors the boat’s state when connected and serves as a fallback interface.</w:t>
+      </w:r>
+    </w:p>
+    <w:p>
+      <w:pPr>
+        <w:pStyle w:val="SourceCode"/>
+      </w:pPr>
+      <w:r>
+        <w:rPr>
+          <w:rStyle w:val="VerbatimChar"/>
+        </w:rPr>
+        <w:t xml:space="preserve">                    ┌─────────────────────────┐</w:t>
+      </w:r>
+      <w:r>
+        <w:br/>
+      </w:r>
+      <w:r>
+        <w:rPr>
+          <w:rStyle w:val="VerbatimChar"/>
+        </w:rPr>
+        <w:t xml:space="preserve">                    │   Cloud Twin             │</w:t>
+      </w:r>
+      <w:r>
+        <w:br/>
+      </w:r>
+      <w:r>
+        <w:rPr>
+          <w:rStyle w:val="VerbatimChar"/>
+        </w:rPr>
+        <w:t xml:space="preserve">                    │   (Above Deck Docker)    │</w:t>
+      </w:r>
+      <w:r>
+        <w:br/>
+      </w:r>
+      <w:r>
+        <w:rPr>
+          <w:rStyle w:val="VerbatimChar"/>
+        </w:rPr>
+        <w:t xml:space="preserve">                    │   --mode=cloud           │</w:t>
+      </w:r>
+      <w:r>
+        <w:br/>
+      </w:r>
+      <w:r>
+        <w:rPr>
+          <w:rStyle w:val="VerbatimChar"/>
+        </w:rPr>
+        <w:t xml:space="preserve">                    │                          │</w:t>
+      </w:r>
+      <w:r>
+        <w:br/>
+      </w:r>
+      <w:r>
+        <w:rPr>
+          <w:rStyle w:val="VerbatimChar"/>
+        </w:rPr>
+        <w:t xml:space="preserve">                    │   - Last known state     │</w:t>
+      </w:r>
+      <w:r>
+        <w:br/>
+      </w:r>
+      <w:r>
+        <w:rPr>
+          <w:rStyle w:val="VerbatimChar"/>
+        </w:rPr>
+        <w:t xml:space="preserve">                    │   - Historical data      │</w:t>
+      </w:r>
+      <w:r>
+        <w:br/>
+      </w:r>
+      <w:r>
+        <w:rPr>
+          <w:rStyle w:val="VerbatimChar"/>
+        </w:rPr>
+        <w:t xml:space="preserve">                    │   - Alert forwarding     │</w:t>
+      </w:r>
+      <w:r>
+        <w:br/>
+      </w:r>
+      <w:r>
+        <w:rPr>
+          <w:rStyle w:val="VerbatimChar"/>
+        </w:rPr>
+        <w:t xml:space="preserve">                    │   - Social features      │</w:t>
+      </w:r>
+      <w:r>
+        <w:br/>
+      </w:r>
+      <w:r>
+        <w:rPr>
+          <w:rStyle w:val="VerbatimChar"/>
+        </w:rPr>
+        <w:t xml:space="preserve">                    │   - PWA accessible       │</w:t>
+      </w:r>
+      <w:r>
+        <w:br/>
+      </w:r>
+      <w:r>
+        <w:rPr>
+          <w:rStyle w:val="VerbatimChar"/>
+        </w:rPr>
+        <w:t xml:space="preserve">                    └────────┬────────────────┘</w:t>
+      </w:r>
+      <w:r>
+        <w:br/>
+      </w:r>
+      <w:r>
+        <w:rPr>
+          <w:rStyle w:val="VerbatimChar"/>
+        </w:rPr>
+        <w:t xml:space="preserve">                             │ Starlink / cellular</w:t>
+      </w:r>
+      <w:r>
+        <w:br/>
+      </w:r>
+      <w:r>
+        <w:rPr>
+          <w:rStyle w:val="VerbatimChar"/>
+        </w:rPr>
+        <w:t xml:space="preserve">                             │ (when available)</w:t>
+      </w:r>
+      <w:r>
+        <w:br/>
+      </w:r>
+      <w:r>
+        <w:rPr>
+          <w:rStyle w:val="VerbatimChar"/>
+        </w:rPr>
+        <w:t xml:space="preserve">                    ┌────────┴────────────────┐</w:t>
+      </w:r>
+      <w:r>
+        <w:br/>
+      </w:r>
+      <w:r>
+        <w:rPr>
+          <w:rStyle w:val="VerbatimChar"/>
+        </w:rPr>
+        <w:t xml:space="preserve">                    │   Boat Server (primary)  │</w:t>
+      </w:r>
+      <w:r>
+        <w:br/>
+      </w:r>
+      <w:r>
+        <w:rPr>
+          <w:rStyle w:val="VerbatimChar"/>
+        </w:rPr>
+        <w:t xml:space="preserve">                    │   --mode=boat            │</w:t>
+      </w:r>
+      <w:r>
+        <w:br/>
+      </w:r>
+      <w:r>
+        <w:rPr>
+          <w:rStyle w:val="VerbatimChar"/>
+        </w:rPr>
+        <w:t xml:space="preserve">                    │   RPi / NUC + Go server  │</w:t>
+      </w:r>
+      <w:r>
+        <w:br/>
+      </w:r>
+      <w:r>
+        <w:rPr>
+          <w:rStyle w:val="VerbatimChar"/>
+        </w:rPr>
+        <w:t xml:space="preserve">                    │                          │</w:t>
+      </w:r>
+      <w:r>
+        <w:br/>
+      </w:r>
+      <w:r>
+        <w:rPr>
+          <w:rStyle w:val="VerbatimChar"/>
+        </w:rPr>
+        <w:t xml:space="preserve">                    │   - Live instrument data  │</w:t>
+      </w:r>
+      <w:r>
+        <w:br/>
+      </w:r>
+      <w:r>
+        <w:rPr>
+          <w:rStyle w:val="VerbatimChar"/>
+        </w:rPr>
+        <w:t xml:space="preserve">                    │   - NMEA / Victron / IoT │</w:t>
+      </w:r>
+      <w:r>
+        <w:br/>
+      </w:r>
+      <w:r>
+        <w:rPr>
+          <w:rStyle w:val="VerbatimChar"/>
+        </w:rPr>
+        <w:t xml:space="preserve">                    │   - Full functionality   │</w:t>
+      </w:r>
+      <w:r>
+        <w:br/>
+      </w:r>
+      <w:r>
+        <w:rPr>
+          <w:rStyle w:val="VerbatimChar"/>
+        </w:rPr>
+        <w:t xml:space="preserve">                    └──────────────────────────┘</w:t>
+      </w:r>
+    </w:p>
+    <w:p>
+      <w:pPr>
+        <w:pStyle w:val="FirstParagraph"/>
+      </w:pPr>
       <w:r>
         <w:rPr>
           <w:b/>
           <w:bCs/>
         </w:rPr>
-        <w:t xml:space="preserve">Status:</w:t>
-      </w:r>
-      <w:r>
-        <w:t xml:space="preserve"> </w:t>
-      </w:r>
-      <w:r>
-        <w:t xml:space="preserve">Research complete</w:t>
-      </w:r>
-      <w:r>
-        <w:t xml:space="preserve"> </w:t>
-      </w:r>
+        <w:t xml:space="preserve">Three operating modes:</w:t>
+      </w:r>
+    </w:p>
+    <w:tbl>
+      <w:tblPr>
+        <w:tblStyle w:val="Table"/>
+        <w:tblW w:type="pct" w:w="5000"/>
+        <w:tblLayout w:type="fixed"/>
+        <w:tblLook w:firstRow="1" w:lastRow="0" w:firstColumn="0" w:lastColumn="0" w:noHBand="0" w:noVBand="0" w:val="0020"/>
+        <w:tblBorders>
+          <w:top w:val="single" w:sz="4" w:space="0" w:color="AAAAAA"/>
+          <w:left w:val="single" w:sz="4" w:space="0" w:color="AAAAAA"/>
+          <w:bottom w:val="single" w:sz="4" w:space="0" w:color="AAAAAA"/>
+          <w:right w:val="single" w:sz="4" w:space="0" w:color="AAAAAA"/>
+          <w:insideH w:val="single" w:sz="4" w:space="0" w:color="AAAAAA"/>
+          <w:insideV w:val="single" w:sz="4" w:space="0" w:color="AAAAAA"/>
+        </w:tblBorders>
+      </w:tblPr>
+      <w:tblGrid>
+        <w:gridCol w:w="2066"/>
+        <w:gridCol w:w="2066"/>
+        <w:gridCol w:w="3787"/>
+      </w:tblGrid>
+      <w:tr>
+        <w:trPr>
+          <w:tblHeader w:val="on"/>
+        </w:trPr>
+        <w:tc>
+          <w:tcPr/>
+          <w:p>
+            <w:pPr>
+              <w:pStyle w:val="Compact"/>
+            </w:pPr>
+            <w:r>
+              <w:t xml:space="preserve">Mode</w:t>
+            </w:r>
+          </w:p>
+        </w:tc>
+        <w:tc>
+          <w:tcPr/>
+          <w:p>
+            <w:pPr>
+              <w:pStyle w:val="Compact"/>
+            </w:pPr>
+            <w:r>
+              <w:t xml:space="preserve">When</w:t>
+            </w:r>
+          </w:p>
+        </w:tc>
+        <w:tc>
+          <w:tcPr/>
+          <w:p>
+            <w:pPr>
+              <w:pStyle w:val="Compact"/>
+            </w:pPr>
+            <w:r>
+              <w:t xml:space="preserve">What Works</w:t>
+            </w:r>
+          </w:p>
+        </w:tc>
+      </w:tr>
+      <w:tr>
+        <w:tc>
+          <w:tcPr/>
+          <w:p>
+            <w:pPr>
+              <w:pStyle w:val="Compact"/>
+            </w:pPr>
+            <w:r>
+              <w:rPr>
+                <w:b/>
+                <w:bCs/>
+              </w:rPr>
+              <w:t xml:space="preserve">Local only</w:t>
+            </w:r>
+          </w:p>
+        </w:tc>
+        <w:tc>
+          <w:tcPr/>
+          <w:p>
+            <w:pPr>
+              <w:pStyle w:val="Compact"/>
+            </w:pPr>
+            <w:r>
+              <w:t xml:space="preserve">At sea, no internet</w:t>
+            </w:r>
+          </w:p>
+        </w:tc>
+        <w:tc>
+          <w:tcPr/>
+          <w:p>
+            <w:pPr>
+              <w:pStyle w:val="Compact"/>
+            </w:pPr>
+            <w:r>
+              <w:t xml:space="preserve">Full functionality from boat server. PWA connects over boat WiFi</w:t>
+            </w:r>
+          </w:p>
+        </w:tc>
+      </w:tr>
+      <w:tr>
+        <w:tc>
+          <w:tcPr/>
+          <w:p>
+            <w:pPr>
+              <w:pStyle w:val="Compact"/>
+            </w:pPr>
+            <w:r>
+              <w:rPr>
+                <w:b/>
+                <w:bCs/>
+              </w:rPr>
+              <w:t xml:space="preserve">Connected</w:t>
+            </w:r>
+          </w:p>
+        </w:tc>
+        <w:tc>
+          <w:tcPr/>
+          <w:p>
+            <w:pPr>
+              <w:pStyle w:val="Compact"/>
+            </w:pPr>
+            <w:r>
+              <w:t xml:space="preserve">Starlink/cellular available</w:t>
+            </w:r>
+          </w:p>
+        </w:tc>
+        <w:tc>
+          <w:tcPr/>
+          <w:p>
+            <w:pPr>
+              <w:pStyle w:val="Compact"/>
+            </w:pPr>
+            <w:r>
+              <w:t xml:space="preserve">Boat server is primary. Cloud gets real-time sync — position, battery, bilge, alerts</w:t>
+            </w:r>
+          </w:p>
+        </w:tc>
+      </w:tr>
+      <w:tr>
+        <w:tc>
+          <w:tcPr/>
+          <w:p>
+            <w:pPr>
+              <w:pStyle w:val="Compact"/>
+            </w:pPr>
+            <w:r>
+              <w:rPr>
+                <w:b/>
+                <w:bCs/>
+              </w:rPr>
+              <w:t xml:space="preserve">Failover</w:t>
+            </w:r>
+          </w:p>
+        </w:tc>
+        <w:tc>
+          <w:tcPr/>
+          <w:p>
+            <w:pPr>
+              <w:pStyle w:val="Compact"/>
+            </w:pPr>
+            <w:r>
+              <w:t xml:space="preserve">Boat server down + internet available</w:t>
+            </w:r>
+          </w:p>
+        </w:tc>
+        <w:tc>
+          <w:tcPr/>
+          <w:p>
+            <w:pPr>
+              <w:pStyle w:val="Compact"/>
+            </w:pPr>
+            <w:r>
+              <w:t xml:space="preserve">Cloud serves last-known state, forwards alerts, shows position history</w:t>
+            </w:r>
+          </w:p>
+        </w:tc>
+      </w:tr>
+    </w:tbl>
+    <w:p>
+      <w:pPr>
+        <w:pStyle w:val="BodyText"/>
+      </w:pPr>
       <w:r>
         <w:rPr>
           <w:b/>
           <w:bCs/>
         </w:rPr>
+        <w:t xml:space="preserve">Go server modes:</w:t>
+      </w:r>
+      <w:r>
+        <w:t xml:space="preserve"> </w:t>
+      </w:r>
+      <w:r>
+        <w:t xml:space="preserve">-</w:t>
+      </w:r>
+      <w:r>
+        <w:t xml:space="preserve"> </w:t>
+      </w:r>
+      <w:r>
+        <w:rPr>
+          <w:rStyle w:val="VerbatimChar"/>
+        </w:rPr>
+        <w:t xml:space="preserve">--mode=boat</w:t>
+      </w:r>
+      <w:r>
+        <w:t xml:space="preserve"> </w:t>
+      </w:r>
+      <w:r>
+        <w:t xml:space="preserve">— connects to hardware (NMEA, Victron, Matter), serves local PWA, syncs outbound when connected</w:t>
+      </w:r>
+      <w:r>
+        <w:t xml:space="preserve"> </w:t>
+      </w:r>
+      <w:r>
+        <w:t xml:space="preserve">-</w:t>
+      </w:r>
+      <w:r>
+        <w:t xml:space="preserve"> </w:t>
+      </w:r>
+      <w:r>
+        <w:rPr>
+          <w:rStyle w:val="VerbatimChar"/>
+        </w:rPr>
+        <w:t xml:space="preserve">--mode=cloud</w:t>
+      </w:r>
+      <w:r>
+        <w:t xml:space="preserve"> </w:t>
+      </w:r>
+      <w:r>
+        <w:t xml:space="preserve">— receives sync data, serves remote PWA, no hardware adapters, enables social features</w:t>
+      </w:r>
+    </w:p>
+    <w:bookmarkEnd w:id="289"/>
+    <w:bookmarkStart w:id="290" w:name="what-syncs-vs.-what-doesnt"/>
+    <w:p>
+      <w:pPr>
+        <w:pStyle w:val="Heading3"/>
+      </w:pPr>
+      <w:r>
+        <w:t xml:space="preserve">7.2 What Syncs vs. What Doesn’t</w:t>
+      </w:r>
+    </w:p>
+    <w:tbl>
+      <w:tblPr>
+        <w:tblStyle w:val="Table"/>
+        <w:tblW w:type="auto" w:w="0"/>
+        <w:tblLook w:firstRow="1" w:lastRow="0" w:firstColumn="0" w:lastColumn="0" w:noHBand="0" w:noVBand="0" w:val="0020"/>
+        <w:tblBorders>
+          <w:top w:val="single" w:sz="4" w:space="0" w:color="AAAAAA"/>
+          <w:left w:val="single" w:sz="4" w:space="0" w:color="AAAAAA"/>
+          <w:bottom w:val="single" w:sz="4" w:space="0" w:color="AAAAAA"/>
+          <w:right w:val="single" w:sz="4" w:space="0" w:color="AAAAAA"/>
+          <w:insideH w:val="single" w:sz="4" w:space="0" w:color="AAAAAA"/>
+          <w:insideV w:val="single" w:sz="4" w:space="0" w:color="AAAAAA"/>
+        </w:tblBorders>
+      </w:tblPr>
+      <w:tblGrid>
+        <w:gridCol w:w="1980"/>
+        <w:gridCol w:w="1980"/>
+        <w:gridCol w:w="1980"/>
+        <w:gridCol w:w="1980"/>
+      </w:tblGrid>
+      <w:tr>
+        <w:trPr>
+          <w:tblHeader w:val="on"/>
+        </w:trPr>
+        <w:tc>
+          <w:tcPr/>
+          <w:p>
+            <w:pPr>
+              <w:pStyle w:val="Compact"/>
+            </w:pPr>
+            <w:r>
+              <w:t xml:space="preserve">Data</w:t>
+            </w:r>
+          </w:p>
+        </w:tc>
+        <w:tc>
+          <w:tcPr/>
+          <w:p>
+            <w:pPr>
+              <w:pStyle w:val="Compact"/>
+            </w:pPr>
+            <w:r>
+              <w:t xml:space="preserve">Sync to Cloud?</w:t>
+            </w:r>
+          </w:p>
+        </w:tc>
+        <w:tc>
+          <w:tcPr/>
+          <w:p>
+            <w:pPr>
+              <w:pStyle w:val="Compact"/>
+            </w:pPr>
+            <w:r>
+              <w:t xml:space="preserve">Direction</w:t>
+            </w:r>
+          </w:p>
+        </w:tc>
+        <w:tc>
+          <w:tcPr/>
+          <w:p>
+            <w:pPr>
+              <w:pStyle w:val="Compact"/>
+            </w:pPr>
+            <w:r>
+              <w:t xml:space="preserve">Why</w:t>
+            </w:r>
+          </w:p>
+        </w:tc>
+      </w:tr>
+      <w:tr>
+        <w:tc>
+          <w:tcPr/>
+          <w:p>
+            <w:pPr>
+              <w:pStyle w:val="Compact"/>
+            </w:pPr>
+            <w:r>
+              <w:t xml:space="preserve">Position (GPS)</w:t>
+            </w:r>
+          </w:p>
+        </w:tc>
+        <w:tc>
+          <w:tcPr/>
+          <w:p>
+            <w:pPr>
+              <w:pStyle w:val="Compact"/>
+            </w:pPr>
+            <w:r>
+              <w:t xml:space="preserve">Yes, every 1-5 min</w:t>
+            </w:r>
+          </w:p>
+        </w:tc>
+        <w:tc>
+          <w:tcPr/>
+          <w:p>
+            <w:pPr>
+              <w:pStyle w:val="Compact"/>
+            </w:pPr>
+            <w:r>
+              <w:t xml:space="preserve">Boat → Cloud</w:t>
+            </w:r>
+          </w:p>
+        </w:tc>
+        <w:tc>
+          <w:tcPr/>
+          <w:p>
+            <w:pPr>
+              <w:pStyle w:val="Compact"/>
+            </w:pPr>
+            <w:r>
+              <w:t xml:space="preserve">Remote tracking, anchor alarm from shore, social</w:t>
+            </w:r>
+          </w:p>
+        </w:tc>
+      </w:tr>
+      <w:tr>
+        <w:tc>
+          <w:tcPr/>
+          <w:p>
+            <w:pPr>
+              <w:pStyle w:val="Compact"/>
+            </w:pPr>
+            <w:r>
+              <w:t xml:space="preserve">Battery/solar state</w:t>
+            </w:r>
+          </w:p>
+        </w:tc>
+        <w:tc>
+          <w:tcPr/>
+          <w:p>
+            <w:pPr>
+              <w:pStyle w:val="Compact"/>
+            </w:pPr>
+            <w:r>
+              <w:t xml:space="preserve">Yes, periodic</w:t>
+            </w:r>
+          </w:p>
+        </w:tc>
+        <w:tc>
+          <w:tcPr/>
+          <w:p>
+            <w:pPr>
+              <w:pStyle w:val="Compact"/>
+            </w:pPr>
+            <w:r>
+              <w:t xml:space="preserve">Boat → Cloud</w:t>
+            </w:r>
+          </w:p>
+        </w:tc>
+        <w:tc>
+          <w:tcPr/>
+          <w:p>
+            <w:pPr>
+              <w:pStyle w:val="Compact"/>
+            </w:pPr>
+            <w:r>
+              <w:t xml:space="preserve">Remote monitoring</w:t>
+            </w:r>
+          </w:p>
+        </w:tc>
+      </w:tr>
+      <w:tr>
+        <w:tc>
+          <w:tcPr/>
+          <w:p>
+            <w:pPr>
+              <w:pStyle w:val="Compact"/>
+            </w:pPr>
+            <w:r>
+              <w:t xml:space="preserve">Bilge/alert status</w:t>
+            </w:r>
+          </w:p>
+        </w:tc>
+        <w:tc>
+          <w:tcPr/>
+          <w:p>
+            <w:pPr>
+              <w:pStyle w:val="Compact"/>
+            </w:pPr>
+            <w:r>
+              <w:t xml:space="preserve">Yes, immediately</w:t>
+            </w:r>
+          </w:p>
+        </w:tc>
+        <w:tc>
+          <w:tcPr/>
+          <w:p>
+            <w:pPr>
+              <w:pStyle w:val="Compact"/>
+            </w:pPr>
+            <w:r>
+              <w:t xml:space="preserve">Boat → Cloud</w:t>
+            </w:r>
+          </w:p>
+        </w:tc>
+        <w:tc>
+          <w:tcPr/>
+          <w:p>
+            <w:pPr>
+              <w:pStyle w:val="Compact"/>
+            </w:pPr>
+            <w:r>
+              <w:t xml:space="preserve">Safety-critical</w:t>
+            </w:r>
+          </w:p>
+        </w:tc>
+      </w:tr>
+      <w:tr>
+        <w:tc>
+          <w:tcPr/>
+          <w:p>
+            <w:pPr>
+              <w:pStyle w:val="Compact"/>
+            </w:pPr>
+            <w:r>
+              <w:t xml:space="preserve">Routes/waypoints</w:t>
+            </w:r>
+          </w:p>
+        </w:tc>
+        <w:tc>
+          <w:tcPr/>
+          <w:p>
+            <w:pPr>
+              <w:pStyle w:val="Compact"/>
+            </w:pPr>
+            <w:r>
+              <w:t xml:space="preserve">Yes</w:t>
+            </w:r>
+          </w:p>
+        </w:tc>
+        <w:tc>
+          <w:tcPr/>
+          <w:p>
+            <w:pPr>
+              <w:pStyle w:val="Compact"/>
+            </w:pPr>
+            <w:r>
+              <w:t xml:space="preserve">Bidirectional</w:t>
+            </w:r>
+          </w:p>
+        </w:tc>
+        <w:tc>
+          <w:tcPr/>
+          <w:p>
+            <w:pPr>
+              <w:pStyle w:val="Compact"/>
+            </w:pPr>
+            <w:r>
+              <w:t xml:space="preserve">Plan from anywhere</w:t>
+            </w:r>
+          </w:p>
+        </w:tc>
+      </w:tr>
+      <w:tr>
+        <w:tc>
+          <w:tcPr/>
+          <w:p>
+            <w:pPr>
+              <w:pStyle w:val="Compact"/>
+            </w:pPr>
+            <w:r>
+              <w:t xml:space="preserve">Boat config</w:t>
+            </w:r>
+          </w:p>
+        </w:tc>
+        <w:tc>
+          <w:tcPr/>
+          <w:p>
+            <w:pPr>
+              <w:pStyle w:val="Compact"/>
+            </w:pPr>
+            <w:r>
+              <w:t xml:space="preserve">Yes</w:t>
+            </w:r>
+          </w:p>
+        </w:tc>
+        <w:tc>
+          <w:tcPr/>
+          <w:p>
+            <w:pPr>
+              <w:pStyle w:val="Compact"/>
+            </w:pPr>
+            <w:r>
+              <w:t xml:space="preserve">Bidirectional</w:t>
+            </w:r>
+          </w:p>
+        </w:tc>
+        <w:tc>
+          <w:tcPr/>
+          <w:p>
+            <w:pPr>
+              <w:pStyle w:val="Compact"/>
+            </w:pPr>
+            <w:r>
+              <w:t xml:space="preserve">Backup, restore after SD card failure</w:t>
+            </w:r>
+          </w:p>
+        </w:tc>
+      </w:tr>
+      <w:tr>
+        <w:tc>
+          <w:tcPr/>
+          <w:p>
+            <w:pPr>
+              <w:pStyle w:val="Compact"/>
+            </w:pPr>
+            <w:r>
+              <w:t xml:space="preserve">Community data</w:t>
+            </w:r>
+          </w:p>
+        </w:tc>
+        <w:tc>
+          <w:tcPr/>
+          <w:p>
+            <w:pPr>
+              <w:pStyle w:val="Compact"/>
+            </w:pPr>
+            <w:r>
+              <w:t xml:space="preserve">Yes</w:t>
+            </w:r>
+          </w:p>
+        </w:tc>
+        <w:tc>
+          <w:tcPr/>
+          <w:p>
+            <w:pPr>
+              <w:pStyle w:val="Compact"/>
+            </w:pPr>
+            <w:r>
+              <w:t xml:space="preserve">Bidirectional</w:t>
+            </w:r>
+          </w:p>
+        </w:tc>
+        <w:tc>
+          <w:tcPr/>
+          <w:p>
+            <w:pPr>
+              <w:pStyle w:val="Compact"/>
+            </w:pPr>
+            <w:r>
+              <w:t xml:space="preserve">Community sync hub</w:t>
+            </w:r>
+          </w:p>
+        </w:tc>
+      </w:tr>
+      <w:tr>
+        <w:tc>
+          <w:tcPr/>
+          <w:p>
+            <w:pPr>
+              <w:pStyle w:val="Compact"/>
+            </w:pPr>
+            <w:r>
+              <w:t xml:space="preserve">Logbook entries</w:t>
+            </w:r>
+          </w:p>
+        </w:tc>
+        <w:tc>
+          <w:tcPr/>
+          <w:p>
+            <w:pPr>
+              <w:pStyle w:val="Compact"/>
+            </w:pPr>
+            <w:r>
+              <w:t xml:space="preserve">Yes</w:t>
+            </w:r>
+          </w:p>
+        </w:tc>
+        <w:tc>
+          <w:tcPr/>
+          <w:p>
+            <w:pPr>
+              <w:pStyle w:val="Compact"/>
+            </w:pPr>
+            <w:r>
+              <w:t xml:space="preserve">Bidirectional</w:t>
+            </w:r>
+          </w:p>
+        </w:tc>
+        <w:tc>
+          <w:tcPr/>
+          <w:p>
+            <w:pPr>
+              <w:pStyle w:val="Compact"/>
+            </w:pPr>
+            <w:r>
+              <w:t xml:space="preserve">Legal record, backup</w:t>
+            </w:r>
+          </w:p>
+        </w:tc>
+      </w:tr>
+      <w:tr>
+        <w:tc>
+          <w:tcPr/>
+          <w:p>
+            <w:pPr>
+              <w:pStyle w:val="Compact"/>
+            </w:pPr>
+            <w:r>
+              <w:t xml:space="preserve">Raw instrument telemetry</w:t>
+            </w:r>
+          </w:p>
+        </w:tc>
+        <w:tc>
+          <w:tcPr/>
+          <w:p>
+            <w:pPr>
+              <w:pStyle w:val="Compact"/>
+            </w:pPr>
+            <w:r>
+              <w:rPr>
+                <w:b/>
+                <w:bCs/>
+              </w:rPr>
+              <w:t xml:space="preserve">No</w:t>
+            </w:r>
+          </w:p>
+        </w:tc>
+        <w:tc>
+          <w:tcPr/>
+          <w:p>
+            <w:pPr>
+              <w:pStyle w:val="Compact"/>
+            </w:pPr>
+            <w:r>
+              <w:t xml:space="preserve">—</w:t>
+            </w:r>
+          </w:p>
+        </w:tc>
+        <w:tc>
+          <w:tcPr/>
+          <w:p>
+            <w:pPr>
+              <w:pStyle w:val="Compact"/>
+            </w:pPr>
+            <w:r>
+              <w:t xml:space="preserve">Too much data, too fast. Stays local</w:t>
+            </w:r>
+          </w:p>
+        </w:tc>
+      </w:tr>
+      <w:tr>
+        <w:tc>
+          <w:tcPr/>
+          <w:p>
+            <w:pPr>
+              <w:pStyle w:val="Compact"/>
+            </w:pPr>
+            <w:r>
+              <w:t xml:space="preserve">Chart tiles</w:t>
+            </w:r>
+          </w:p>
+        </w:tc>
+        <w:tc>
+          <w:tcPr/>
+          <w:p>
+            <w:pPr>
+              <w:pStyle w:val="Compact"/>
+            </w:pPr>
+            <w:r>
+              <w:rPr>
+                <w:b/>
+                <w:bCs/>
+              </w:rPr>
+              <w:t xml:space="preserve">No</w:t>
+            </w:r>
+          </w:p>
+        </w:tc>
+        <w:tc>
+          <w:tcPr/>
+          <w:p>
+            <w:pPr>
+              <w:pStyle w:val="Compact"/>
+            </w:pPr>
+            <w:r>
+              <w:t xml:space="preserve">—</w:t>
+            </w:r>
+          </w:p>
+        </w:tc>
+        <w:tc>
+          <w:tcPr/>
+          <w:p>
+            <w:pPr>
+              <w:pStyle w:val="Compact"/>
+            </w:pPr>
+            <w:r>
+              <w:t xml:space="preserve">Too large. Downloaded separately</w:t>
+            </w:r>
+          </w:p>
+        </w:tc>
+      </w:tr>
+      <w:tr>
+        <w:tc>
+          <w:tcPr/>
+          <w:p>
+            <w:pPr>
+              <w:pStyle w:val="Compact"/>
+            </w:pPr>
+            <w:r>
+              <w:t xml:space="preserve">Camera feeds</w:t>
+            </w:r>
+          </w:p>
+        </w:tc>
+        <w:tc>
+          <w:tcPr/>
+          <w:p>
+            <w:pPr>
+              <w:pStyle w:val="Compact"/>
+            </w:pPr>
+            <w:r>
+              <w:rPr>
+                <w:b/>
+                <w:bCs/>
+              </w:rPr>
+              <w:t xml:space="preserve">No</w:t>
+            </w:r>
+          </w:p>
+        </w:tc>
+        <w:tc>
+          <w:tcPr/>
+          <w:p>
+            <w:pPr>
+              <w:pStyle w:val="Compact"/>
+            </w:pPr>
+            <w:r>
+              <w:t xml:space="preserve">—</w:t>
+            </w:r>
+          </w:p>
+        </w:tc>
+        <w:tc>
+          <w:tcPr/>
+          <w:p>
+            <w:pPr>
+              <w:pStyle w:val="Compact"/>
+            </w:pPr>
+            <w:r>
+              <w:t xml:space="preserve">Bandwidth-prohibitive offshore</w:t>
+            </w:r>
+          </w:p>
+        </w:tc>
+      </w:tr>
+    </w:tbl>
+    <w:bookmarkEnd w:id="290"/>
+    <w:bookmarkStart w:id="291" w:name="how-this-differs-from-ais"/>
+    <w:p>
+      <w:pPr>
+        <w:pStyle w:val="Heading3"/>
+      </w:pPr>
+      <w:r>
+        <w:t xml:space="preserve">7.3 How This Differs from AIS</w:t>
+      </w:r>
+    </w:p>
+    <w:p>
+      <w:pPr>
+        <w:pStyle w:val="FirstParagraph"/>
+      </w:pPr>
+      <w:r>
+        <w:t xml:space="preserve">AIS is the existing</w:t>
+      </w:r>
+      <w:r>
+        <w:t xml:space="preserve"> </w:t>
+      </w:r>
+      <w:r>
+        <w:t xml:space="preserve">“where are boats?”</w:t>
+      </w:r>
+      <w:r>
+        <w:t xml:space="preserve"> </w:t>
+      </w:r>
+      <w:r>
+        <w:t xml:space="preserve">system. But it has significant limitations:</w:t>
+      </w:r>
+    </w:p>
+    <w:tbl>
+      <w:tblPr>
+        <w:tblStyle w:val="Table"/>
+        <w:tblW w:type="auto" w:w="0"/>
+        <w:tblLook w:firstRow="1" w:lastRow="0" w:firstColumn="0" w:lastColumn="0" w:noHBand="0" w:noVBand="0" w:val="0020"/>
+        <w:tblBorders>
+          <w:top w:val="single" w:sz="4" w:space="0" w:color="AAAAAA"/>
+          <w:left w:val="single" w:sz="4" w:space="0" w:color="AAAAAA"/>
+          <w:bottom w:val="single" w:sz="4" w:space="0" w:color="AAAAAA"/>
+          <w:right w:val="single" w:sz="4" w:space="0" w:color="AAAAAA"/>
+          <w:insideH w:val="single" w:sz="4" w:space="0" w:color="AAAAAA"/>
+          <w:insideV w:val="single" w:sz="4" w:space="0" w:color="AAAAAA"/>
+        </w:tblBorders>
+      </w:tblPr>
+      <w:tblGrid>
+        <w:gridCol w:w="2640"/>
+        <w:gridCol w:w="2640"/>
+        <w:gridCol w:w="2640"/>
+      </w:tblGrid>
+      <w:tr>
+        <w:trPr>
+          <w:tblHeader w:val="on"/>
+        </w:trPr>
+        <w:tc>
+          <w:tcPr/>
+          <w:p>
+            <w:pPr>
+              <w:pStyle w:val="Compact"/>
+            </w:pPr>
+            <w:r>
+              <w:t xml:space="preserve">Aspect</w:t>
+            </w:r>
+          </w:p>
+        </w:tc>
+        <w:tc>
+          <w:tcPr/>
+          <w:p>
+            <w:pPr>
+              <w:pStyle w:val="Compact"/>
+            </w:pPr>
+            <w:r>
+              <w:t xml:space="preserve">AIS (Class B)</w:t>
+            </w:r>
+          </w:p>
+        </w:tc>
+        <w:tc>
+          <w:tcPr/>
+          <w:p>
+            <w:pPr>
+              <w:pStyle w:val="Compact"/>
+            </w:pPr>
+            <w:r>
+              <w:t xml:space="preserve">Above Deck Cloud</w:t>
+            </w:r>
+          </w:p>
+        </w:tc>
+      </w:tr>
+      <w:tr>
+        <w:tc>
+          <w:tcPr/>
+          <w:p>
+            <w:pPr>
+              <w:pStyle w:val="Compact"/>
+            </w:pPr>
+            <w:r>
+              <w:rPr>
+                <w:b/>
+                <w:bCs/>
+              </w:rPr>
+              <w:t xml:space="preserve">Range</w:t>
+            </w:r>
+          </w:p>
+        </w:tc>
+        <w:tc>
+          <w:tcPr/>
+          <w:p>
+            <w:pPr>
+              <w:pStyle w:val="Compact"/>
+            </w:pPr>
+            <w:r>
+              <w:t xml:space="preserve">5-7 nm (Class B), 20 nm (Class A) — VHF line of sight only</w:t>
+            </w:r>
+          </w:p>
+        </w:tc>
+        <w:tc>
+          <w:tcPr/>
+          <w:p>
+            <w:pPr>
+              <w:pStyle w:val="Compact"/>
+            </w:pPr>
+            <w:r>
+              <w:t xml:space="preserve">Global (anywhere with internet)</w:t>
+            </w:r>
+          </w:p>
+        </w:tc>
+      </w:tr>
+      <w:tr>
+        <w:tc>
+          <w:tcPr/>
+          <w:p>
+            <w:pPr>
+              <w:pStyle w:val="Compact"/>
+            </w:pPr>
+            <w:r>
+              <w:rPr>
+                <w:b/>
+                <w:bCs/>
+              </w:rPr>
+              <w:t xml:space="preserve">Offshore</w:t>
+            </w:r>
+          </w:p>
+        </w:tc>
+        <w:tc>
+          <w:tcPr/>
+          <w:p>
+            <w:pPr>
+              <w:pStyle w:val="Compact"/>
+            </w:pPr>
+            <w:r>
+              <w:t xml:space="preserve">Invisible mid-ocean unless satellite AIS (expensive, delayed)</w:t>
+            </w:r>
+          </w:p>
+        </w:tc>
+        <w:tc>
+          <w:tcPr/>
+          <w:p>
+            <w:pPr>
+              <w:pStyle w:val="Compact"/>
+            </w:pPr>
+            <w:r>
+              <w:t xml:space="preserve">Real-time via Starlink</w:t>
+            </w:r>
+          </w:p>
+        </w:tc>
+      </w:tr>
+      <w:tr>
+        <w:tc>
+          <w:tcPr/>
+          <w:p>
+            <w:pPr>
+              <w:pStyle w:val="Compact"/>
+            </w:pPr>
+            <w:r>
+              <w:rPr>
+                <w:b/>
+                <w:bCs/>
+              </w:rPr>
+              <w:t xml:space="preserve">At anchor</w:t>
+            </w:r>
+          </w:p>
+        </w:tc>
+        <w:tc>
+          <w:tcPr/>
+          <w:p>
+            <w:pPr>
+              <w:pStyle w:val="Compact"/>
+            </w:pPr>
+            <w:r>
+              <w:t xml:space="preserve">Many cruisers turn AIS off to save power</w:t>
+            </w:r>
+          </w:p>
+        </w:tc>
+        <w:tc>
+          <w:tcPr/>
+          <w:p>
+            <w:pPr>
+              <w:pStyle w:val="Compact"/>
+            </w:pPr>
+            <w:r>
+              <w:t xml:space="preserve">Cloud shows last-known + battery trend</w:t>
+            </w:r>
+          </w:p>
+        </w:tc>
+      </w:tr>
+      <w:tr>
+        <w:tc>
+          <w:tcPr/>
+          <w:p>
+            <w:pPr>
+              <w:pStyle w:val="Compact"/>
+            </w:pPr>
+            <w:r>
+              <w:rPr>
+                <w:b/>
+                <w:bCs/>
+              </w:rPr>
+              <w:t xml:space="preserve">Data</w:t>
+            </w:r>
+          </w:p>
+        </w:tc>
+        <w:tc>
+          <w:tcPr/>
+          <w:p>
+            <w:pPr>
+              <w:pStyle w:val="Compact"/>
+            </w:pPr>
+            <w:r>
+              <w:t xml:space="preserve">Position, SOG, COG, vessel name only</w:t>
+            </w:r>
+          </w:p>
+        </w:tc>
+        <w:tc>
+          <w:tcPr/>
+          <w:p>
+            <w:pPr>
+              <w:pStyle w:val="Compact"/>
+            </w:pPr>
+            <w:r>
+              <w:t xml:space="preserve">Position + battery + bilge + solar + temp + alerts + everything</w:t>
+            </w:r>
+          </w:p>
+        </w:tc>
+      </w:tr>
+      <w:tr>
+        <w:tc>
+          <w:tcPr/>
+          <w:p>
+            <w:pPr>
+              <w:pStyle w:val="Compact"/>
+            </w:pPr>
+            <w:r>
+              <w:rPr>
+                <w:b/>
+                <w:bCs/>
+              </w:rPr>
+              <w:t xml:space="preserve">Who sees you</w:t>
+            </w:r>
+          </w:p>
+        </w:tc>
+        <w:tc>
+          <w:tcPr/>
+          <w:p>
+            <w:pPr>
+              <w:pStyle w:val="Compact"/>
+            </w:pPr>
+            <w:r>
+              <w:t xml:space="preserve">Anyone with AIS receiver in range</w:t>
+            </w:r>
+          </w:p>
+        </w:tc>
+        <w:tc>
+          <w:tcPr/>
+          <w:p>
+            <w:pPr>
+              <w:pStyle w:val="Compact"/>
+            </w:pPr>
+            <w:r>
+              <w:t xml:space="preserve">Only people you choose to share with (privacy controls)</w:t>
+            </w:r>
+          </w:p>
+        </w:tc>
+      </w:tr>
+      <w:tr>
+        <w:tc>
+          <w:tcPr/>
+          <w:p>
+            <w:pPr>
+              <w:pStyle w:val="Compact"/>
+            </w:pPr>
+            <w:r>
+              <w:rPr>
+                <w:b/>
+                <w:bCs/>
+              </w:rPr>
+              <w:t xml:space="preserve">History</w:t>
+            </w:r>
+          </w:p>
+        </w:tc>
+        <w:tc>
+          <w:tcPr/>
+          <w:p>
+            <w:pPr>
+              <w:pStyle w:val="Compact"/>
+            </w:pPr>
+            <w:r>
+              <w:t xml:space="preserve">None (real-time only)</w:t>
+            </w:r>
+          </w:p>
+        </w:tc>
+        <w:tc>
+          <w:tcPr/>
+          <w:p>
+            <w:pPr>
+              <w:pStyle w:val="Compact"/>
+            </w:pPr>
+            <w:r>
+              <w:t xml:space="preserve">Full track history, anchor swing, passage log</w:t>
+            </w:r>
+          </w:p>
+        </w:tc>
+      </w:tr>
+      <w:tr>
+        <w:tc>
+          <w:tcPr/>
+          <w:p>
+            <w:pPr>
+              <w:pStyle w:val="Compact"/>
+            </w:pPr>
+            <w:r>
+              <w:rPr>
+                <w:b/>
+                <w:bCs/>
+              </w:rPr>
+              <w:t xml:space="preserve">Cost</w:t>
+            </w:r>
+          </w:p>
+        </w:tc>
+        <w:tc>
+          <w:tcPr/>
+          <w:p>
+            <w:pPr>
+              <w:pStyle w:val="Compact"/>
+            </w:pPr>
+            <w:r>
+              <w:t xml:space="preserve">Free (hardware ~$300-800 for Class B)</w:t>
+            </w:r>
+          </w:p>
+        </w:tc>
+        <w:tc>
+          <w:tcPr/>
+          <w:p>
+            <w:pPr>
+              <w:pStyle w:val="Compact"/>
+            </w:pPr>
+            <w:r>
+              <w:t xml:space="preserve">Free (self-hosted) or $5/month VPS</w:t>
+            </w:r>
+          </w:p>
+        </w:tc>
+      </w:tr>
+      <w:tr>
+        <w:tc>
+          <w:tcPr/>
+          <w:p>
+            <w:pPr>
+              <w:pStyle w:val="Compact"/>
+            </w:pPr>
+            <w:r>
+              <w:rPr>
+                <w:b/>
+                <w:bCs/>
+              </w:rPr>
+              <w:t xml:space="preserve">Alerts</w:t>
+            </w:r>
+          </w:p>
+        </w:tc>
+        <w:tc>
+          <w:tcPr/>
+          <w:p>
+            <w:pPr>
+              <w:pStyle w:val="Compact"/>
+            </w:pPr>
+            <w:r>
+              <w:t xml:space="preserve">None</w:t>
+            </w:r>
+          </w:p>
+        </w:tc>
+        <w:tc>
+          <w:tcPr/>
+          <w:p>
+            <w:pPr>
+              <w:pStyle w:val="Compact"/>
+            </w:pPr>
+            <w:r>
+              <w:t xml:space="preserve">Push notifications to phone when bilge triggers, anchor drags, battery low</w:t>
+            </w:r>
+          </w:p>
+        </w:tc>
+      </w:tr>
+    </w:tbl>
+    <w:p>
+      <w:pPr>
+        <w:pStyle w:val="BodyText"/>
+      </w:pPr>
+      <w:r>
+        <w:rPr>
+          <w:b/>
+          <w:bCs/>
+        </w:rPr>
+        <w:t xml:space="preserve">AIS gives position to strangers nearby. Above Deck Cloud gives everything to people you trust, anywhere.</w:t>
+      </w:r>
+    </w:p>
+    <w:bookmarkEnd w:id="291"/>
+    <w:bookmarkStart w:id="292" w:name="Xac605939c296a5bc5f3b325f8ceee6b2ef09165"/>
+    <w:p>
+      <w:pPr>
+        <w:pStyle w:val="Heading3"/>
+      </w:pPr>
+      <w:r>
+        <w:t xml:space="preserve">7.4 Social Features: Find My Friends for Boats</w:t>
+      </w:r>
+    </w:p>
+    <w:p>
+      <w:pPr>
+        <w:pStyle w:val="FirstParagraph"/>
+      </w:pPr>
+      <w:r>
+        <w:t xml:space="preserve">The cloud twin model naturally enables social features that AIS cannot:</w:t>
+      </w:r>
+    </w:p>
+    <w:p>
+      <w:pPr>
+        <w:pStyle w:val="BodyText"/>
+      </w:pPr>
+      <w:r>
+        <w:rPr>
+          <w:b/>
+          <w:bCs/>
+        </w:rPr>
+        <w:t xml:space="preserve">Find My Crew:</w:t>
+      </w:r>
+      <w:r>
+        <w:t xml:space="preserve"> </w:t>
+      </w:r>
+      <w:r>
+        <w:t xml:space="preserve">- Share your position with selected friends/family</w:t>
+      </w:r>
+      <w:r>
+        <w:t xml:space="preserve"> </w:t>
+      </w:r>
+      <w:r>
+        <w:t xml:space="preserve">- See friends’ boats on your chartplotter in real-time</w:t>
+      </w:r>
+      <w:r>
+        <w:t xml:space="preserve"> </w:t>
+      </w:r>
+      <w:r>
+        <w:t xml:space="preserve">- Privacy controls: share with specific people, time-limited sharing, accuracy degradation (marina-level vs exact position)</w:t>
+      </w:r>
+      <w:r>
+        <w:t xml:space="preserve"> </w:t>
+      </w:r>
+      <w:r>
+        <w:t xml:space="preserve">-</w:t>
+      </w:r>
+      <w:r>
+        <w:t xml:space="preserve"> </w:t>
+      </w:r>
+      <w:r>
+        <w:t xml:space="preserve">“I’m heading to Falmouth”</w:t>
+      </w:r>
+      <w:r>
+        <w:t xml:space="preserve"> </w:t>
+      </w:r>
+      <w:r>
+        <w:t xml:space="preserve">→ friends see your progress</w:t>
+      </w:r>
+    </w:p>
+    <w:p>
+      <w:pPr>
+        <w:pStyle w:val="BodyText"/>
+      </w:pPr>
+      <w:r>
+        <w:rPr>
+          <w:b/>
+          <w:bCs/>
+        </w:rPr>
+        <w:t xml:space="preserve">Who’s on the Mooring / In the Anchorage:</w:t>
+      </w:r>
+      <w:r>
+        <w:t xml:space="preserve"> </w:t>
+      </w:r>
+      <w:r>
+        <w:t xml:space="preserve">- When boats with Above Deck arrive at an anchorage, they appear on the chart</w:t>
+      </w:r>
+      <w:r>
+        <w:t xml:space="preserve"> </w:t>
+      </w:r>
+      <w:r>
+        <w:t xml:space="preserve">- See who else is there, when they arrived, how long they’ve been there</w:t>
+      </w:r>
+      <w:r>
+        <w:t xml:space="preserve"> </w:t>
+      </w:r>
+      <w:r>
+        <w:t xml:space="preserve">-</w:t>
+      </w:r>
+      <w:r>
+        <w:t xml:space="preserve"> </w:t>
+      </w:r>
+      <w:r>
+        <w:rPr>
+          <w:b/>
+          <w:bCs/>
+        </w:rPr>
+        <w:t xml:space="preserve">Opt-in social</w:t>
+      </w:r>
+      <w:r>
+        <w:t xml:space="preserve"> </w:t>
+      </w:r>
+      <w:r>
+        <w:t xml:space="preserve">— only visible if you choose to be. Not broadcasting to the world like AIS</w:t>
+      </w:r>
+      <w:r>
+        <w:t xml:space="preserve"> </w:t>
+      </w:r>
+      <w:r>
+        <w:t xml:space="preserve">-</w:t>
+      </w:r>
+      <w:r>
+        <w:t xml:space="preserve"> </w:t>
+      </w:r>
+      <w:r>
+        <w:t xml:space="preserve">“3 Above Deck boats in Studland Bay right now”</w:t>
+      </w:r>
+      <w:r>
+        <w:t xml:space="preserve"> </w:t>
+      </w:r>
+      <w:r>
+        <w:t xml:space="preserve">- Could integrate with community anchorage reviews —</w:t>
+      </w:r>
+      <w:r>
+        <w:t xml:space="preserve"> </w:t>
+      </w:r>
+      <w:r>
+        <w:t xml:space="preserve">“I’m here now, conditions are good, room for 10 more boats”</w:t>
+      </w:r>
+    </w:p>
+    <w:p>
+      <w:pPr>
+        <w:pStyle w:val="BodyText"/>
+      </w:pPr>
+      <w:r>
+        <w:rPr>
+          <w:b/>
+          <w:bCs/>
+        </w:rPr>
+        <w:t xml:space="preserve">Rally/Flotilla Mode:</w:t>
+      </w:r>
+      <w:r>
+        <w:t xml:space="preserve"> </w:t>
+      </w:r>
+      <w:r>
+        <w:t xml:space="preserve">- Rally organiser creates a group</w:t>
+      </w:r>
+      <w:r>
+        <w:t xml:space="preserve"> </w:t>
+      </w:r>
+      <w:r>
+        <w:t xml:space="preserve">- All participating boats sync to one cloud instance</w:t>
+      </w:r>
+      <w:r>
+        <w:t xml:space="preserve"> </w:t>
+      </w:r>
+      <w:r>
+        <w:t xml:space="preserve">- Real-time fleet tracker on a shared map</w:t>
+      </w:r>
+      <w:r>
+        <w:t xml:space="preserve"> </w:t>
+      </w:r>
+      <w:r>
+        <w:t xml:space="preserve">- Group messaging (via Meshtastic when offshore, via cloud when connected)</w:t>
+      </w:r>
+      <w:r>
+        <w:t xml:space="preserve"> </w:t>
+      </w:r>
+      <w:r>
+        <w:t xml:space="preserve">- Rally leader sees all boats’ positions, battery states, ETAs</w:t>
+      </w:r>
+      <w:r>
+        <w:t xml:space="preserve"> </w:t>
+      </w:r>
+      <w:r>
+        <w:t xml:space="preserve">- Automatic daily position reports</w:t>
+      </w:r>
+    </w:p>
+    <w:p>
+      <w:pPr>
+        <w:pStyle w:val="BodyText"/>
+      </w:pPr>
+      <w:r>
+        <w:rPr>
+          <w:b/>
+          <w:bCs/>
+        </w:rPr>
+        <w:t xml:space="preserve">Buddy System Hosting:</w:t>
+      </w:r>
+      <w:r>
+        <w:t xml:space="preserve"> </w:t>
+      </w:r>
+      <w:r>
+        <w:t xml:space="preserve">- Sailor A hosts a cloud instance at home (or on a $5 VPS)</w:t>
+      </w:r>
+      <w:r>
+        <w:t xml:space="preserve"> </w:t>
+      </w:r>
+      <w:r>
+        <w:t xml:space="preserve">- Adds friends’ boats as tenants</w:t>
+      </w:r>
+      <w:r>
+        <w:t xml:space="preserve"> </w:t>
+      </w:r>
+      <w:r>
+        <w:t xml:space="preserve">- All boats’ cloud backups run on one instance</w:t>
+      </w:r>
+      <w:r>
+        <w:t xml:space="preserve"> </w:t>
+      </w:r>
+      <w:r>
+        <w:t xml:space="preserve">- When both are offshore with Starlink, they see each other</w:t>
+      </w:r>
+      <w:r>
+        <w:t xml:space="preserve"> </w:t>
+      </w:r>
+      <w:r>
+        <w:t xml:space="preserve">-</w:t>
+      </w:r>
+      <w:r>
+        <w:t xml:space="preserve"> </w:t>
+      </w:r>
+      <w:r>
+        <w:rPr>
+          <w:b/>
+          <w:bCs/>
+        </w:rPr>
+        <w:t xml:space="preserve">Self-hosted fleet management</w:t>
+      </w:r>
+      <w:r>
+        <w:t xml:space="preserve"> </w:t>
+      </w:r>
+      <w:r>
+        <w:t xml:space="preserve">— no vendor, no subscription</w:t>
+      </w:r>
+    </w:p>
+    <w:p>
+      <w:pPr>
+        <w:pStyle w:val="BodyText"/>
+      </w:pPr>
+      <w:r>
+        <w:rPr>
+          <w:b/>
+          <w:bCs/>
+        </w:rPr>
+        <w:t xml:space="preserve">Passage Buddy:</w:t>
+      </w:r>
+      <w:r>
+        <w:t xml:space="preserve"> </w:t>
+      </w:r>
+      <w:r>
+        <w:t xml:space="preserve">- Planning a channel crossing? See which friends are planning the same weather window</w:t>
+      </w:r>
+      <w:r>
+        <w:t xml:space="preserve"> </w:t>
+      </w:r>
+      <w:r>
+        <w:t xml:space="preserve">- Share departure times, routes, estimated positions</w:t>
+      </w:r>
+      <w:r>
+        <w:t xml:space="preserve"> </w:t>
+      </w:r>
+      <w:r>
+        <w:t xml:space="preserve">-</w:t>
+      </w:r>
+      <w:r>
+        <w:t xml:space="preserve"> </w:t>
+      </w:r>
+      <w:r>
+        <w:t xml:space="preserve">“Buddy pair”</w:t>
+      </w:r>
+      <w:r>
+        <w:t xml:space="preserve"> </w:t>
+      </w:r>
+      <w:r>
+        <w:t xml:space="preserve">— two boats agree to monitor each other during a passage</w:t>
+      </w:r>
+      <w:r>
+        <w:t xml:space="preserve"> </w:t>
+      </w:r>
+      <w:r>
+        <w:t xml:space="preserve">- If one boat stops sending updates, the other gets alerted</w:t>
+      </w:r>
+    </w:p>
+    <w:bookmarkEnd w:id="292"/>
+    <w:bookmarkStart w:id="293" w:name="privacy-model"/>
+    <w:p>
+      <w:pPr>
+        <w:pStyle w:val="Heading3"/>
+      </w:pPr>
+      <w:r>
+        <w:t xml:space="preserve">7.5 Privacy Model</w:t>
+      </w:r>
+    </w:p>
+    <w:p>
+      <w:pPr>
+        <w:pStyle w:val="FirstParagraph"/>
+      </w:pPr>
+      <w:r>
+        <w:t xml:space="preserve">This is critical — sailors are protective of their position data.</w:t>
+      </w:r>
+    </w:p>
+    <w:tbl>
+      <w:tblPr>
+        <w:tblStyle w:val="Table"/>
+        <w:tblW w:type="auto" w:w="0"/>
+        <w:tblLook w:firstRow="1" w:lastRow="0" w:firstColumn="0" w:lastColumn="0" w:noHBand="0" w:noVBand="0" w:val="0020"/>
+        <w:tblBorders>
+          <w:top w:val="single" w:sz="4" w:space="0" w:color="AAAAAA"/>
+          <w:left w:val="single" w:sz="4" w:space="0" w:color="AAAAAA"/>
+          <w:bottom w:val="single" w:sz="4" w:space="0" w:color="AAAAAA"/>
+          <w:right w:val="single" w:sz="4" w:space="0" w:color="AAAAAA"/>
+          <w:insideH w:val="single" w:sz="4" w:space="0" w:color="AAAAAA"/>
+          <w:insideV w:val="single" w:sz="4" w:space="0" w:color="AAAAAA"/>
+        </w:tblBorders>
+      </w:tblPr>
+      <w:tblGrid>
+        <w:gridCol w:w="3960"/>
+        <w:gridCol w:w="3960"/>
+      </w:tblGrid>
+      <w:tr>
+        <w:trPr>
+          <w:tblHeader w:val="on"/>
+        </w:trPr>
+        <w:tc>
+          <w:tcPr/>
+          <w:p>
+            <w:pPr>
+              <w:pStyle w:val="Compact"/>
+            </w:pPr>
+            <w:r>
+              <w:t xml:space="preserve">Setting</w:t>
+            </w:r>
+          </w:p>
+        </w:tc>
+        <w:tc>
+          <w:tcPr/>
+          <w:p>
+            <w:pPr>
+              <w:pStyle w:val="Compact"/>
+            </w:pPr>
+            <w:r>
+              <w:t xml:space="preserve">What It Means</w:t>
+            </w:r>
+          </w:p>
+        </w:tc>
+      </w:tr>
+      <w:tr>
+        <w:tc>
+          <w:tcPr/>
+          <w:p>
+            <w:pPr>
+              <w:pStyle w:val="Compact"/>
+            </w:pPr>
+            <w:r>
+              <w:rPr>
+                <w:b/>
+                <w:bCs/>
+              </w:rPr>
+              <w:t xml:space="preserve">Ghost mode</w:t>
+            </w:r>
+          </w:p>
+        </w:tc>
+        <w:tc>
+          <w:tcPr/>
+          <w:p>
+            <w:pPr>
+              <w:pStyle w:val="Compact"/>
+            </w:pPr>
+            <w:r>
+              <w:t xml:space="preserve">No position shared. Cloud twin stores data but doesn’t share location with anyone</w:t>
+            </w:r>
+          </w:p>
+        </w:tc>
+      </w:tr>
+      <w:tr>
+        <w:tc>
+          <w:tcPr/>
+          <w:p>
+            <w:pPr>
+              <w:pStyle w:val="Compact"/>
+            </w:pPr>
+            <w:r>
+              <w:rPr>
+                <w:b/>
+                <w:bCs/>
+              </w:rPr>
+              <w:t xml:space="preserve">Friends only</w:t>
+            </w:r>
+          </w:p>
+        </w:tc>
+        <w:tc>
+          <w:tcPr/>
+          <w:p>
+            <w:pPr>
+              <w:pStyle w:val="Compact"/>
+            </w:pPr>
+            <w:r>
+              <w:t xml:space="preserve">Position visible to approved contacts only</w:t>
+            </w:r>
+          </w:p>
+        </w:tc>
+      </w:tr>
+      <w:tr>
+        <w:tc>
+          <w:tcPr/>
+          <w:p>
+            <w:pPr>
+              <w:pStyle w:val="Compact"/>
+            </w:pPr>
+            <w:r>
+              <w:rPr>
+                <w:b/>
+                <w:bCs/>
+              </w:rPr>
+              <w:t xml:space="preserve">Anchorage social</w:t>
+            </w:r>
+          </w:p>
+        </w:tc>
+        <w:tc>
+          <w:tcPr/>
+          <w:p>
+            <w:pPr>
+              <w:pStyle w:val="Compact"/>
+            </w:pPr>
+            <w:r>
+              <w:t xml:space="preserve">Visible as</w:t>
+            </w:r>
+            <w:r>
+              <w:t xml:space="preserve"> </w:t>
+            </w:r>
+            <w:r>
+              <w:t xml:space="preserve">“a boat”</w:t>
+            </w:r>
+            <w:r>
+              <w:t xml:space="preserve"> </w:t>
+            </w:r>
+            <w:r>
+              <w:t xml:space="preserve">in anchorages (not name/identity) unless friend</w:t>
+            </w:r>
+          </w:p>
+        </w:tc>
+      </w:tr>
+      <w:tr>
+        <w:tc>
+          <w:tcPr/>
+          <w:p>
+            <w:pPr>
+              <w:pStyle w:val="Compact"/>
+            </w:pPr>
+            <w:r>
+              <w:rPr>
+                <w:b/>
+                <w:bCs/>
+              </w:rPr>
+              <w:t xml:space="preserve">Rally mode</w:t>
+            </w:r>
+          </w:p>
+        </w:tc>
+        <w:tc>
+          <w:tcPr/>
+          <w:p>
+            <w:pPr>
+              <w:pStyle w:val="Compact"/>
+            </w:pPr>
+            <w:r>
+              <w:t xml:space="preserve">Visible to all rally participants</w:t>
+            </w:r>
+          </w:p>
+        </w:tc>
+      </w:tr>
+      <w:tr>
+        <w:tc>
+          <w:tcPr/>
+          <w:p>
+            <w:pPr>
+              <w:pStyle w:val="Compact"/>
+            </w:pPr>
+            <w:r>
+              <w:rPr>
+                <w:b/>
+                <w:bCs/>
+              </w:rPr>
+              <w:t xml:space="preserve">Public track</w:t>
+            </w:r>
+          </w:p>
+        </w:tc>
+        <w:tc>
+          <w:tcPr/>
+          <w:p>
+            <w:pPr>
+              <w:pStyle w:val="Compact"/>
+            </w:pPr>
+            <w:r>
+              <w:t xml:space="preserve">Full track visible (for bloggers, YouTube sailors who want to share journeys)</w:t>
+            </w:r>
+          </w:p>
+        </w:tc>
+      </w:tr>
+      <w:tr>
+        <w:tc>
+          <w:tcPr/>
+          <w:p>
+            <w:pPr>
+              <w:pStyle w:val="Compact"/>
+            </w:pPr>
+            <w:r>
+              <w:rPr>
+                <w:b/>
+                <w:bCs/>
+              </w:rPr>
+              <w:t xml:space="preserve">Time-limited share</w:t>
+            </w:r>
+          </w:p>
+        </w:tc>
+        <w:tc>
+          <w:tcPr/>
+          <w:p>
+            <w:pPr>
+              <w:pStyle w:val="Compact"/>
+            </w:pPr>
+            <w:r>
+              <w:t xml:space="preserve">Share position for next 24 hours only (useful for</w:t>
+            </w:r>
+            <w:r>
+              <w:t xml:space="preserve"> </w:t>
+            </w:r>
+            <w:r>
+              <w:t xml:space="preserve">“I’m arriving tomorrow”</w:t>
+            </w:r>
+            <w:r>
+              <w:t xml:space="preserve">)</w:t>
+            </w:r>
+          </w:p>
+        </w:tc>
+      </w:tr>
+    </w:tbl>
+    <w:p>
+      <w:pPr>
+        <w:pStyle w:val="BodyText"/>
+      </w:pPr>
+      <w:r>
+        <w:t xml:space="preserve">Default is</w:t>
+      </w:r>
+      <w:r>
+        <w:t xml:space="preserve"> </w:t>
+      </w:r>
+      <w:r>
+        <w:rPr>
+          <w:b/>
+          <w:bCs/>
+        </w:rPr>
+        <w:t xml:space="preserve">Ghost mode</w:t>
+      </w:r>
+      <w:r>
+        <w:t xml:space="preserve">. Social features are opt-in, not opt-out.</w:t>
+      </w:r>
+    </w:p>
+    <w:bookmarkEnd w:id="293"/>
+    <w:bookmarkStart w:id="294" w:name="hosting-options"/>
+    <w:p>
+      <w:pPr>
+        <w:pStyle w:val="Heading3"/>
+      </w:pPr>
+      <w:r>
+        <w:t xml:space="preserve">7.6 Hosting Options</w:t>
+      </w:r>
+    </w:p>
+    <w:tbl>
+      <w:tblPr>
+        <w:tblStyle w:val="Table"/>
+        <w:tblW w:type="auto" w:w="0"/>
+        <w:tblLook w:firstRow="1" w:lastRow="0" w:firstColumn="0" w:lastColumn="0" w:noHBand="0" w:noVBand="0" w:val="0020"/>
+        <w:tblBorders>
+          <w:top w:val="single" w:sz="4" w:space="0" w:color="AAAAAA"/>
+          <w:left w:val="single" w:sz="4" w:space="0" w:color="AAAAAA"/>
+          <w:bottom w:val="single" w:sz="4" w:space="0" w:color="AAAAAA"/>
+          <w:right w:val="single" w:sz="4" w:space="0" w:color="AAAAAA"/>
+          <w:insideH w:val="single" w:sz="4" w:space="0" w:color="AAAAAA"/>
+          <w:insideV w:val="single" w:sz="4" w:space="0" w:color="AAAAAA"/>
+        </w:tblBorders>
+      </w:tblPr>
+      <w:tblGrid>
+        <w:gridCol w:w="2640"/>
+        <w:gridCol w:w="2640"/>
+        <w:gridCol w:w="2640"/>
+      </w:tblGrid>
+      <w:tr>
+        <w:trPr>
+          <w:tblHeader w:val="on"/>
+        </w:trPr>
+        <w:tc>
+          <w:tcPr/>
+          <w:p>
+            <w:pPr>
+              <w:pStyle w:val="Compact"/>
+            </w:pPr>
+            <w:r>
+              <w:t xml:space="preserve">Option</w:t>
+            </w:r>
+          </w:p>
+        </w:tc>
+        <w:tc>
+          <w:tcPr/>
+          <w:p>
+            <w:pPr>
+              <w:pStyle w:val="Compact"/>
+            </w:pPr>
+            <w:r>
+              <w:t xml:space="preserve">Cost</w:t>
+            </w:r>
+          </w:p>
+        </w:tc>
+        <w:tc>
+          <w:tcPr/>
+          <w:p>
+            <w:pPr>
+              <w:pStyle w:val="Compact"/>
+            </w:pPr>
+            <w:r>
+              <w:t xml:space="preserve">Who It’s For</w:t>
+            </w:r>
+          </w:p>
+        </w:tc>
+      </w:tr>
+      <w:tr>
+        <w:tc>
+          <w:tcPr/>
+          <w:p>
+            <w:pPr>
+              <w:pStyle w:val="Compact"/>
+            </w:pPr>
+            <w:r>
+              <w:rPr>
+                <w:b/>
+                <w:bCs/>
+              </w:rPr>
+              <w:t xml:space="preserve">Self-hosted VPS</w:t>
+            </w:r>
+            <w:r>
+              <w:t xml:space="preserve"> </w:t>
+            </w:r>
+            <w:r>
+              <w:t xml:space="preserve">(Hetzner, DigitalOcean)</w:t>
+            </w:r>
+          </w:p>
+        </w:tc>
+        <w:tc>
+          <w:tcPr/>
+          <w:p>
+            <w:pPr>
+              <w:pStyle w:val="Compact"/>
+            </w:pPr>
+            <w:r>
+              <w:t xml:space="preserve">$4-6/month</w:t>
+            </w:r>
+          </w:p>
+        </w:tc>
+        <w:tc>
+          <w:tcPr/>
+          <w:p>
+            <w:pPr>
+              <w:pStyle w:val="Compact"/>
+            </w:pPr>
+            <w:r>
+              <w:t xml:space="preserve">Technical sailors, privacy-focused</w:t>
+            </w:r>
+          </w:p>
+        </w:tc>
+      </w:tr>
+      <w:tr>
+        <w:tc>
+          <w:tcPr/>
+          <w:p>
+            <w:pPr>
+              <w:pStyle w:val="Compact"/>
+            </w:pPr>
+            <w:r>
+              <w:rPr>
+                <w:b/>
+                <w:bCs/>
+              </w:rPr>
+              <w:t xml:space="preserve">Above Deck community cloud</w:t>
+            </w:r>
+            <w:r>
+              <w:t xml:space="preserve"> </w:t>
+            </w:r>
+            <w:r>
+              <w:t xml:space="preserve">(if project grows)</w:t>
+            </w:r>
+          </w:p>
+        </w:tc>
+        <w:tc>
+          <w:tcPr/>
+          <w:p>
+            <w:pPr>
+              <w:pStyle w:val="Compact"/>
+            </w:pPr>
+            <w:r>
+              <w:t xml:space="preserve">Free tier (1 boat, basic sync)</w:t>
+            </w:r>
+          </w:p>
+        </w:tc>
+        <w:tc>
+          <w:tcPr/>
+          <w:p>
+            <w:pPr>
+              <w:pStyle w:val="Compact"/>
+            </w:pPr>
+            <w:r>
+              <w:t xml:space="preserve">Everyone</w:t>
+            </w:r>
+          </w:p>
+        </w:tc>
+      </w:tr>
+      <w:tr>
+        <w:tc>
+          <w:tcPr/>
+          <w:p>
+            <w:pPr>
+              <w:pStyle w:val="Compact"/>
+            </w:pPr>
+            <w:r>
+              <w:rPr>
+                <w:b/>
+                <w:bCs/>
+              </w:rPr>
+              <w:t xml:space="preserve">Home server / NAS</w:t>
+            </w:r>
+          </w:p>
+        </w:tc>
+        <w:tc>
+          <w:tcPr/>
+          <w:p>
+            <w:pPr>
+              <w:pStyle w:val="Compact"/>
+            </w:pPr>
+            <w:r>
+              <w:t xml:space="preserve">Free (own hardware)</w:t>
+            </w:r>
+          </w:p>
+        </w:tc>
+        <w:tc>
+          <w:tcPr/>
+          <w:p>
+            <w:pPr>
+              <w:pStyle w:val="Compact"/>
+            </w:pPr>
+            <w:r>
+              <w:t xml:space="preserve">People with Synology/QNAP at home</w:t>
+            </w:r>
+          </w:p>
+        </w:tc>
+      </w:tr>
+      <w:tr>
+        <w:tc>
+          <w:tcPr/>
+          <w:p>
+            <w:pPr>
+              <w:pStyle w:val="Compact"/>
+            </w:pPr>
+            <w:r>
+              <w:rPr>
+                <w:b/>
+                <w:bCs/>
+              </w:rPr>
+              <w:t xml:space="preserve">Buddy hosting</w:t>
+            </w:r>
+          </w:p>
+        </w:tc>
+        <w:tc>
+          <w:tcPr/>
+          <w:p>
+            <w:pPr>
+              <w:pStyle w:val="Compact"/>
+            </w:pPr>
+            <w:r>
+              <w:t xml:space="preserve">Free (friend’s VPS/server)</w:t>
+            </w:r>
+          </w:p>
+        </w:tc>
+        <w:tc>
+          <w:tcPr/>
+          <w:p>
+            <w:pPr>
+              <w:pStyle w:val="Compact"/>
+            </w:pPr>
+            <w:r>
+              <w:t xml:space="preserve">Cruising friends sharing an instance</w:t>
+            </w:r>
+          </w:p>
+        </w:tc>
+      </w:tr>
+      <w:tr>
+        <w:tc>
+          <w:tcPr/>
+          <w:p>
+            <w:pPr>
+              <w:pStyle w:val="Compact"/>
+            </w:pPr>
+            <w:r>
+              <w:rPr>
+                <w:b/>
+                <w:bCs/>
+              </w:rPr>
+              <w:t xml:space="preserve">Above Deck on Supabase</w:t>
+            </w:r>
+          </w:p>
+        </w:tc>
+        <w:tc>
+          <w:tcPr/>
+          <w:p>
+            <w:pPr>
+              <w:pStyle w:val="Compact"/>
+            </w:pPr>
+            <w:r>
+              <w:t xml:space="preserve">Free tier covers most</w:t>
+            </w:r>
+          </w:p>
+        </w:tc>
+        <w:tc>
+          <w:tcPr/>
+          <w:p>
+            <w:pPr>
+              <w:pStyle w:val="Compact"/>
+            </w:pPr>
+            <w:r>
+              <w:t xml:space="preserve">Simplest — community data + boat sync on Supabase directly</w:t>
+            </w:r>
+          </w:p>
+        </w:tc>
+      </w:tr>
+    </w:tbl>
+    <w:bookmarkEnd w:id="294"/>
+    <w:bookmarkStart w:id="295" w:name="real-scenarios"/>
+    <w:p>
+      <w:pPr>
+        <w:pStyle w:val="Heading3"/>
+      </w:pPr>
+      <w:r>
+        <w:t xml:space="preserve">7.7 Real Scenarios</w:t>
+      </w:r>
+    </w:p>
+    <w:p>
+      <w:pPr>
+        <w:pStyle w:val="FirstParagraph"/>
+      </w:pPr>
+      <w:r>
+        <w:rPr>
+          <w:b/>
+          <w:bCs/>
+        </w:rPr>
+        <w:t xml:space="preserve">SD card failure at anchor (common):</w:t>
+      </w:r>
+      <w:r>
+        <w:t xml:space="preserve"> </w:t>
+      </w:r>
+      <w:r>
+        <w:t xml:space="preserve">Boat’s RPi SD card corrupts (this happens regularly). You’re at a restaurant ashore. Cloud twin still shows: last known position, battery state trending down, bilge dry, all hatches closed. You know the boat is OK. You replace the SD card tomorrow, restore config from cloud backup, back to normal.</w:t>
+      </w:r>
+    </w:p>
+    <w:p>
+      <w:pPr>
+        <w:pStyle w:val="BodyText"/>
+      </w:pPr>
+      <w:r>
+        <w:rPr>
+          <w:b/>
+          <w:bCs/>
+        </w:rPr>
+        <w:t xml:space="preserve">Family peace of mind:</w:t>
+      </w:r>
+      <w:r>
+        <w:t xml:space="preserve"> </w:t>
+      </w:r>
+      <w:r>
+        <w:t xml:space="preserve">Partner at home opens Above Deck PWA → sees your boat’s position mid-Atlantic, battery at 78%, solar producing well, 142nm to go. No panicked satellite phone call needed.</w:t>
+      </w:r>
+    </w:p>
+    <w:p>
+      <w:pPr>
+        <w:pStyle w:val="BodyText"/>
+      </w:pPr>
+      <w:r>
+        <w:rPr>
+          <w:b/>
+          <w:bCs/>
+        </w:rPr>
+        <w:t xml:space="preserve">Marina winter storage:</w:t>
+      </w:r>
+      <w:r>
+        <w:t xml:space="preserve"> </w:t>
+      </w:r>
+      <w:r>
+        <w:t xml:space="preserve">Boat in a marina for 3 months. Boat server powered down to save battery. But you left a cheap ESP32 Matter sensor on the bilge and one on battery. These report to a Meshtastic node which has cellular backup. Cloud twin gets periodic updates. You check cabin temperature and bilge status from home. No $200/year Raymarine subscription needed.</w:t>
+      </w:r>
+    </w:p>
+    <w:p>
+      <w:pPr>
+        <w:pStyle w:val="BodyText"/>
+      </w:pPr>
+      <w:r>
+        <w:rPr>
+          <w:b/>
+          <w:bCs/>
+        </w:rPr>
+        <w:t xml:space="preserve">Convergence at an anchorage:</w:t>
+      </w:r>
+      <w:r>
+        <w:t xml:space="preserve"> </w:t>
+      </w:r>
+      <w:r>
+        <w:t xml:space="preserve">You arrive in Portofino. Your chartplotter shows 2 friends already there. You send a message via the app:</w:t>
+      </w:r>
+      <w:r>
+        <w:t xml:space="preserve"> </w:t>
+      </w:r>
+      <w:r>
+        <w:t xml:space="preserve">“Arriving in 30 min, anchoring near the north wall.”</w:t>
+      </w:r>
+      <w:r>
+        <w:t xml:space="preserve"> </w:t>
+      </w:r>
+      <w:r>
+        <w:t xml:space="preserve">They send back:</w:t>
+      </w:r>
+      <w:r>
+        <w:t xml:space="preserve"> </w:t>
+      </w:r>
+      <w:r>
+        <w:t xml:space="preserve">“Good holding in sand, 4m at low tide. Drinks at the bar at 7?”</w:t>
+      </w:r>
+    </w:p>
+    <w:p>
+      <w:r>
+        <w:pict>
+          <v:rect style="width:0;height:1.5pt" o:hralign="center" o:hrstd="t" o:hr="t"/>
+        </w:pict>
+      </w:r>
+    </w:p>
+    <w:p>
+      <w:r>
+        <w:pict>
+          <v:rect style="width:0;height:1.5pt" o:hralign="center" o:hrstd="t" o:hr="t"/>
+        </w:pict>
+      </w:r>
+    </w:p>
+    <w:bookmarkEnd w:id="295"/>
+    <w:bookmarkEnd w:id="296"/>
+    <w:bookmarkEnd w:id="297"/>
+    <w:bookmarkStart w:id="298" w:name="appendix-a-can-bus-technology"/>
+    <w:p>
+      <w:pPr>
+        <w:pStyle w:val="Heading1"/>
+      </w:pPr>
+      <w:r>
+        <w:t xml:space="preserve">Appendix A: CAN Bus Technology</w:t>
+      </w:r>
+    </w:p>
+    <w:bookmarkEnd w:id="298"/>
+    <w:bookmarkStart w:id="389" w:name="X6da4e0a24386a4425068bcf5ee7dd23241ff536"/>
+    <w:p>
+      <w:pPr>
+        <w:pStyle w:val="Heading1"/>
+      </w:pPr>
+      <w:r>
+        <w:t xml:space="preserve">CAN Bus Technology: From Automotive Origins to Marine, IoT, and Beyond</w:t>
+      </w:r>
+    </w:p>
+    <w:p>
+      <w:pPr>
+        <w:pStyle w:val="FirstParagraph"/>
+      </w:pPr>
+      <w:r>
+        <w:rPr>
+          <w:b/>
+          <w:bCs/>
+        </w:rPr>
+        <w:t xml:space="preserve">Date:</w:t>
+      </w:r>
+      <w:r>
+        <w:t xml:space="preserve"> </w:t>
+      </w:r>
+      <w:r>
+        <w:t xml:space="preserve">2026-03-20</w:t>
+      </w:r>
+      <w:r>
+        <w:t xml:space="preserve"> </w:t>
+      </w:r>
+      <w:r>
+        <w:rPr>
+          <w:b/>
+          <w:bCs/>
+        </w:rPr>
+        <w:t xml:space="preserve">Status:</w:t>
+      </w:r>
+      <w:r>
+        <w:t xml:space="preserve"> </w:t>
+      </w:r>
+      <w:r>
+        <w:t xml:space="preserve">Research complete</w:t>
+      </w:r>
+      <w:r>
+        <w:t xml:space="preserve"> </w:t>
+      </w:r>
+      <w:r>
+        <w:rPr>
+          <w:b/>
+          <w:bCs/>
+        </w:rPr>
         <w:t xml:space="preserve">Related:</w:t>
       </w:r>
       <w:r>
         <w:t xml:space="preserve"> </w:t>
       </w:r>
-      <w:hyperlink r:id="rId290">
+      <w:hyperlink r:id="rId299">
         <w:r>
           <w:rPr>
             <w:rStyle w:val="Hyperlink"/>
@@ -43909,7 +46329,7 @@
       <w:r>
         <w:t xml:space="preserve"> </w:t>
       </w:r>
-      <w:hyperlink r:id="rId291">
+      <w:hyperlink r:id="rId300">
         <w:r>
           <w:rPr>
             <w:rStyle w:val="Hyperlink"/>
@@ -43926,7 +46346,7 @@
       <w:r>
         <w:t xml:space="preserve"> </w:t>
       </w:r>
-      <w:hyperlink r:id="rId292">
+      <w:hyperlink r:id="rId301">
         <w:r>
           <w:rPr>
             <w:rStyle w:val="Hyperlink"/>
@@ -43942,7 +46362,7 @@
         </w:pict>
       </w:r>
     </w:p>
-    <w:bookmarkStart w:id="293" w:name="executive-summary-4"/>
+    <w:bookmarkStart w:id="302" w:name="executive-summary-4"/>
     <w:p>
       <w:pPr>
         <w:pStyle w:val="Heading2"/>
@@ -43966,8 +46386,8 @@
         </w:pict>
       </w:r>
     </w:p>
-    <w:bookmarkEnd w:id="293"/>
-    <w:bookmarkStart w:id="300" w:name="can-bus-fundamentals"/>
+    <w:bookmarkEnd w:id="302"/>
+    <w:bookmarkStart w:id="309" w:name="can-bus-fundamentals"/>
     <w:p>
       <w:pPr>
         <w:pStyle w:val="Heading2"/>
@@ -43976,7 +46396,7 @@
         <w:t xml:space="preserve">1. CAN Bus Fundamentals</w:t>
       </w:r>
     </w:p>
-    <w:bookmarkStart w:id="294" w:name="history"/>
+    <w:bookmarkStart w:id="303" w:name="history"/>
     <w:p>
       <w:pPr>
         <w:pStyle w:val="Heading3"/>
@@ -44296,8 +46716,8 @@
         </w:tc>
       </w:tr>
     </w:tbl>
-    <w:bookmarkEnd w:id="294"/>
-    <w:bookmarkStart w:id="295" w:name="physical-layer"/>
+    <w:bookmarkEnd w:id="303"/>
+    <w:bookmarkStart w:id="304" w:name="physical-layer"/>
     <w:p>
       <w:pPr>
         <w:pStyle w:val="Heading3"/>
@@ -44418,8 +46838,8 @@
         <w:t xml:space="preserve">CAN uses a linear bus topology (backbone with drop cables). Star topologies are possible with specialised hubs but are not standard. Maximum bus length depends on bit rate — at 1 Mbit/s the bus is limited to ~25m; at 250 kbit/s (NMEA 2000 speed) it reaches ~250m.</w:t>
       </w:r>
     </w:p>
-    <w:bookmarkEnd w:id="295"/>
-    <w:bookmarkStart w:id="296" w:name="protocol-variants"/>
+    <w:bookmarkEnd w:id="304"/>
+    <w:bookmarkStart w:id="305" w:name="protocol-variants"/>
     <w:p>
       <w:pPr>
         <w:pStyle w:val="Heading3"/>
@@ -44848,8 +47268,8 @@
         <w:t xml:space="preserve">is backward-compatible at the arbitration level but switches to a higher bit rate during the data phase. The data payload jumps from 8 bytes to up to 64 bytes. This is particularly important for firmware-over-the-air updates and high-bandwidth sensor data. CAN FD nodes and classical CAN nodes cannot coexist on the same bus segment without a gateway.</w:t>
       </w:r>
     </w:p>
-    <w:bookmarkEnd w:id="296"/>
-    <w:bookmarkStart w:id="297" w:name="how-arbitration-works"/>
+    <w:bookmarkEnd w:id="305"/>
+    <w:bookmarkStart w:id="306" w:name="how-arbitration-works"/>
     <w:p>
       <w:pPr>
         <w:pStyle w:val="Heading3"/>
@@ -44988,8 +47408,8 @@
         <w:t xml:space="preserve">. In NMEA 2000, critical navigation data (e.g., rudder position, rate of turn) is assigned low PGN numbers so it wins arbitration over less time-sensitive data (e.g., environmental temperature).</w:t>
       </w:r>
     </w:p>
-    <w:bookmarkEnd w:id="297"/>
-    <w:bookmarkStart w:id="298" w:name="frame-types"/>
+    <w:bookmarkEnd w:id="306"/>
+    <w:bookmarkStart w:id="307" w:name="frame-types"/>
     <w:p>
       <w:pPr>
         <w:pStyle w:val="Heading3"/>
@@ -45184,8 +47604,8 @@
         <w:t xml:space="preserve"> 1       12 or 32 bits               6 bits    0-64 bits          16    2     7</w:t>
       </w:r>
     </w:p>
-    <w:bookmarkEnd w:id="298"/>
-    <w:bookmarkStart w:id="299" w:name="error-handling"/>
+    <w:bookmarkEnd w:id="307"/>
+    <w:bookmarkStart w:id="308" w:name="error-handling"/>
     <w:p>
       <w:pPr>
         <w:pStyle w:val="Heading3"/>
@@ -45327,9 +47747,9 @@
         </w:pict>
       </w:r>
     </w:p>
-    <w:bookmarkEnd w:id="299"/>
-    <w:bookmarkEnd w:id="300"/>
-    <w:bookmarkStart w:id="309" w:name="who-uses-can-bus"/>
+    <w:bookmarkEnd w:id="308"/>
+    <w:bookmarkEnd w:id="309"/>
+    <w:bookmarkStart w:id="318" w:name="who-uses-can-bus"/>
     <w:p>
       <w:pPr>
         <w:pStyle w:val="Heading2"/>
@@ -45338,7 +47758,7 @@
         <w:t xml:space="preserve">2. Who Uses CAN Bus</w:t>
       </w:r>
     </w:p>
-    <w:bookmarkStart w:id="301" w:name="automotive"/>
+    <w:bookmarkStart w:id="310" w:name="automotive"/>
     <w:p>
       <w:pPr>
         <w:pStyle w:val="Heading3"/>
@@ -45637,8 +48057,8 @@
         <w:t xml:space="preserve">Over 1 billion CAN-enabled nodes are produced annually for automotive alone.</w:t>
       </w:r>
     </w:p>
-    <w:bookmarkEnd w:id="301"/>
-    <w:bookmarkStart w:id="302" w:name="marine"/>
+    <w:bookmarkEnd w:id="310"/>
+    <w:bookmarkStart w:id="311" w:name="marine"/>
     <w:p>
       <w:pPr>
         <w:pStyle w:val="Heading3"/>
@@ -45882,8 +48302,8 @@
         <w:t xml:space="preserve">bridged through gateways.</w:t>
       </w:r>
     </w:p>
-    <w:bookmarkEnd w:id="302"/>
-    <w:bookmarkStart w:id="303" w:name="industrial-canopen-devicenet"/>
+    <w:bookmarkEnd w:id="311"/>
+    <w:bookmarkStart w:id="312" w:name="industrial-canopen-devicenet"/>
     <w:p>
       <w:pPr>
         <w:pStyle w:val="Heading3"/>
@@ -45933,8 +48353,8 @@
         <w:t xml:space="preserve">: The American counterpart, developed by Allen-Bradley (Rockwell Automation). Widely used in automotive manufacturing plants, semiconductor fabs, and chemical processing. DeviceNet runs at 125, 250, or 500 kbit/s.</w:t>
       </w:r>
     </w:p>
-    <w:bookmarkEnd w:id="303"/>
-    <w:bookmarkStart w:id="304" w:name="agricultural-isobus"/>
+    <w:bookmarkEnd w:id="312"/>
+    <w:bookmarkStart w:id="313" w:name="agricultural-isobus"/>
     <w:p>
       <w:pPr>
         <w:pStyle w:val="Heading3"/>
@@ -46001,8 +48421,8 @@
         <w:t xml:space="preserve">Major manufacturers: John Deere, CLAAS, CNH Industrial, AGCO. ISOBUS is to agriculture what NMEA 2000 is to marine.</w:t>
       </w:r>
     </w:p>
-    <w:bookmarkEnd w:id="304"/>
-    <w:bookmarkStart w:id="305" w:name="aerospace-arinc-825"/>
+    <w:bookmarkEnd w:id="313"/>
+    <w:bookmarkStart w:id="314" w:name="aerospace-arinc-825"/>
     <w:p>
       <w:pPr>
         <w:pStyle w:val="Heading3"/>
@@ -46085,8 +48505,8 @@
         <w:t xml:space="preserve">Applications include flight-state sensors, engine control systems (fuel pumps, actuators), navigation systems, and in-flight data acquisition. ARINC 825 coexists with ARINC 429 (the legacy unidirectional avionics bus) on modern aircraft.</w:t>
       </w:r>
     </w:p>
-    <w:bookmarkEnd w:id="305"/>
-    <w:bookmarkStart w:id="306" w:name="medical-equipment"/>
+    <w:bookmarkEnd w:id="314"/>
+    <w:bookmarkStart w:id="315" w:name="medical-equipment"/>
     <w:p>
       <w:pPr>
         <w:pStyle w:val="Heading3"/>
@@ -46159,8 +48579,8 @@
         <w:t xml:space="preserve">The medical market values CAN’s deterministic timing, fault tolerance, and proven reliability from decades of automotive deployment.</w:t>
       </w:r>
     </w:p>
-    <w:bookmarkEnd w:id="306"/>
-    <w:bookmarkStart w:id="307" w:name="ev-solar-and-battery-management"/>
+    <w:bookmarkEnd w:id="315"/>
+    <w:bookmarkStart w:id="316" w:name="ev-solar-and-battery-management"/>
     <w:p>
       <w:pPr>
         <w:pStyle w:val="Heading3"/>
@@ -46265,8 +48685,8 @@
         <w:t xml:space="preserve">LiFePO4 battery packs from EVE, CATL, and others expose CAN bus interfaces. Solar monitoring tools like SolarAssistant can read BMS data over CAN.</w:t>
       </w:r>
     </w:p>
-    <w:bookmarkEnd w:id="307"/>
-    <w:bookmarkStart w:id="308" w:name="rv-and-campervan"/>
+    <w:bookmarkEnd w:id="316"/>
+    <w:bookmarkStart w:id="317" w:name="rv-and-campervan"/>
     <w:p>
       <w:pPr>
         <w:pStyle w:val="Heading3"/>
@@ -46386,9 +48806,9 @@
         </w:pict>
       </w:r>
     </w:p>
-    <w:bookmarkEnd w:id="308"/>
-    <w:bookmarkEnd w:id="309"/>
-    <w:bookmarkStart w:id="310" w:name="can-bus-higher-layer-protocol-comparison"/>
+    <w:bookmarkEnd w:id="317"/>
+    <w:bookmarkEnd w:id="318"/>
+    <w:bookmarkStart w:id="319" w:name="can-bus-higher-layer-protocol-comparison"/>
     <w:p>
       <w:pPr>
         <w:pStyle w:val="Heading2"/>
@@ -47093,8 +49513,8 @@
         </w:pict>
       </w:r>
     </w:p>
-    <w:bookmarkEnd w:id="310"/>
-    <w:bookmarkStart w:id="316" w:name="nmea-2000-on-can-bus-marine-deep-dive"/>
+    <w:bookmarkEnd w:id="319"/>
+    <w:bookmarkStart w:id="325" w:name="nmea-2000-on-can-bus-marine-deep-dive"/>
     <w:p>
       <w:pPr>
         <w:pStyle w:val="Heading2"/>
@@ -47103,7 +49523,7 @@
         <w:t xml:space="preserve">4. NMEA 2000 on CAN Bus (Marine Deep Dive)</w:t>
       </w:r>
     </w:p>
-    <w:bookmarkStart w:id="311" w:name="protocol-architecture"/>
+    <w:bookmarkStart w:id="320" w:name="protocol-architecture"/>
     <w:p>
       <w:pPr>
         <w:pStyle w:val="Heading3"/>
@@ -47203,8 +49623,8 @@
         <w:t xml:space="preserve">└─────────────────────────────────┘</w:t>
       </w:r>
     </w:p>
-    <w:bookmarkEnd w:id="311"/>
-    <w:bookmarkStart w:id="312" w:name="the-29-bit-identifier-structure"/>
+    <w:bookmarkEnd w:id="320"/>
+    <w:bookmarkStart w:id="321" w:name="the-29-bit-identifier-structure"/>
     <w:p>
       <w:pPr>
         <w:pStyle w:val="Heading3"/>
@@ -47346,8 +49766,8 @@
         <w:t xml:space="preserve">(8 bits) — destination address (if addressed) or group extension (if broadcast)</w:t>
       </w:r>
     </w:p>
-    <w:bookmarkEnd w:id="312"/>
-    <w:bookmarkStart w:id="313" w:name="key-pgns"/>
+    <w:bookmarkEnd w:id="321"/>
+    <w:bookmarkStart w:id="322" w:name="key-pgns"/>
     <w:p>
       <w:pPr>
         <w:pStyle w:val="Heading3"/>
@@ -47986,8 +50406,8 @@
         <w:t xml:space="preserve">NMEA 2000 defines over 200 standard PGNs. Manufacturers can also register proprietary PGNs for device-specific data.</w:t>
       </w:r>
     </w:p>
-    <w:bookmarkEnd w:id="313"/>
-    <w:bookmarkStart w:id="314" w:name="fast-packet-protocol"/>
+    <w:bookmarkEnd w:id="322"/>
+    <w:bookmarkStart w:id="323" w:name="fast-packet-protocol"/>
     <w:p>
       <w:pPr>
         <w:pStyle w:val="Heading3"/>
@@ -48056,8 +50476,8 @@
         <w:t xml:space="preserve">Maximum payload: 223 bytes across up to 32 frames</w:t>
       </w:r>
     </w:p>
-    <w:bookmarkEnd w:id="314"/>
-    <w:bookmarkStart w:id="315" w:name="marine-can-bus-products"/>
+    <w:bookmarkEnd w:id="323"/>
+    <w:bookmarkStart w:id="324" w:name="marine-can-bus-products"/>
     <w:p>
       <w:pPr>
         <w:pStyle w:val="Heading3"/>
@@ -48649,9 +51069,9 @@
         </w:pict>
       </w:r>
     </w:p>
-    <w:bookmarkEnd w:id="315"/>
-    <w:bookmarkEnd w:id="316"/>
-    <w:bookmarkStart w:id="321" w:name="can-bus-hardware-for-makers-and-diy"/>
+    <w:bookmarkEnd w:id="324"/>
+    <w:bookmarkEnd w:id="325"/>
+    <w:bookmarkStart w:id="330" w:name="can-bus-hardware-for-makers-and-diy"/>
     <w:p>
       <w:pPr>
         <w:pStyle w:val="Heading2"/>
@@ -48660,7 +51080,7 @@
         <w:t xml:space="preserve">5. CAN Bus Hardware for Makers and DIY</w:t>
       </w:r>
     </w:p>
-    <w:bookmarkStart w:id="317" w:name="can-controllers-and-transceivers"/>
+    <w:bookmarkStart w:id="326" w:name="can-controllers-and-transceivers"/>
     <w:p>
       <w:pPr>
         <w:pStyle w:val="Heading3"/>
@@ -49224,8 +51644,8 @@
         </w:tc>
       </w:tr>
     </w:tbl>
-    <w:bookmarkEnd w:id="317"/>
-    <w:bookmarkStart w:id="318" w:name="microcontroller-platforms"/>
+    <w:bookmarkEnd w:id="326"/>
+    <w:bookmarkStart w:id="327" w:name="microcontroller-platforms"/>
     <w:p>
       <w:pPr>
         <w:pStyle w:val="Heading3"/>
@@ -49767,8 +52187,8 @@
         </w:tc>
       </w:tr>
     </w:tbl>
-    <w:bookmarkEnd w:id="318"/>
-    <w:bookmarkStart w:id="319" w:name="raspberry-pi-can-hats"/>
+    <w:bookmarkEnd w:id="327"/>
+    <w:bookmarkStart w:id="328" w:name="raspberry-pi-can-hats"/>
     <w:p>
       <w:pPr>
         <w:pStyle w:val="Heading3"/>
@@ -50381,8 +52801,8 @@
         <w:t xml:space="preserve">is the best option — two isolated channels (one for NMEA 2000, one for engine/Victron bus), CAN FD ready, SocketCAN compatible, under USD 35.</w:t>
       </w:r>
     </w:p>
-    <w:bookmarkEnd w:id="319"/>
-    <w:bookmarkStart w:id="320" w:name="usb-can-adapters"/>
+    <w:bookmarkEnd w:id="328"/>
+    <w:bookmarkStart w:id="329" w:name="usb-can-adapters"/>
     <w:p>
       <w:pPr>
         <w:pStyle w:val="Heading3"/>
@@ -50989,9 +53409,9 @@
         </w:pict>
       </w:r>
     </w:p>
-    <w:bookmarkEnd w:id="320"/>
-    <w:bookmarkEnd w:id="321"/>
-    <w:bookmarkStart w:id="326" w:name="linux-socketcan"/>
+    <w:bookmarkEnd w:id="329"/>
+    <w:bookmarkEnd w:id="330"/>
+    <w:bookmarkStart w:id="335" w:name="linux-socketcan"/>
     <w:p>
       <w:pPr>
         <w:pStyle w:val="Heading2"/>
@@ -51000,7 +53420,7 @@
         <w:t xml:space="preserve">6. Linux SocketCAN</w:t>
       </w:r>
     </w:p>
-    <w:bookmarkStart w:id="322" w:name="architecture"/>
+    <w:bookmarkStart w:id="331" w:name="architecture"/>
     <w:p>
       <w:pPr>
         <w:pStyle w:val="Heading3"/>
@@ -51145,8 +53565,8 @@
         <w:t xml:space="preserve">└──────────────────────────────────────────┘</w:t>
       </w:r>
     </w:p>
-    <w:bookmarkEnd w:id="322"/>
-    <w:bookmarkStart w:id="323" w:name="setup"/>
+    <w:bookmarkEnd w:id="331"/>
+    <w:bookmarkStart w:id="332" w:name="setup"/>
     <w:p>
       <w:pPr>
         <w:pStyle w:val="Heading3"/>
@@ -51331,8 +53751,8 @@
         <w:t xml:space="preserve"> ip link set can0 type can bitrate 500000 dbitrate 2000000 fd on</w:t>
       </w:r>
     </w:p>
-    <w:bookmarkEnd w:id="323"/>
-    <w:bookmarkStart w:id="324" w:name="can-utils-command-line-tools"/>
+    <w:bookmarkEnd w:id="332"/>
+    <w:bookmarkStart w:id="333" w:name="can-utils-command-line-tools"/>
     <w:p>
       <w:pPr>
         <w:pStyle w:val="Heading3"/>
@@ -51812,8 +54232,8 @@
         <w:t xml:space="preserve"># The mask specifies which bits of the ID must match</w:t>
       </w:r>
     </w:p>
-    <w:bookmarkEnd w:id="324"/>
-    <w:bookmarkStart w:id="325" w:name="virtual-can-for-development"/>
+    <w:bookmarkEnd w:id="333"/>
+    <w:bookmarkStart w:id="334" w:name="virtual-can-for-development"/>
     <w:p>
       <w:pPr>
         <w:pStyle w:val="Heading3"/>
@@ -52009,9 +54429,9 @@
         </w:pict>
       </w:r>
     </w:p>
-    <w:bookmarkEnd w:id="325"/>
-    <w:bookmarkEnd w:id="326"/>
-    <w:bookmarkStart w:id="340" w:name="can-bus-go"/>
+    <w:bookmarkEnd w:id="334"/>
+    <w:bookmarkEnd w:id="335"/>
+    <w:bookmarkStart w:id="349" w:name="can-bus-go"/>
     <w:p>
       <w:pPr>
         <w:pStyle w:val="Heading2"/>
@@ -52020,7 +54440,7 @@
         <w:t xml:space="preserve">7. CAN Bus + Go</w:t>
       </w:r>
     </w:p>
-    <w:bookmarkStart w:id="333" w:name="library-landscape"/>
+    <w:bookmarkStart w:id="342" w:name="library-landscape"/>
     <w:p>
       <w:pPr>
         <w:pStyle w:val="Heading3"/>
@@ -52142,7 +54562,7 @@
             <w:pPr>
               <w:pStyle w:val="Compact"/>
             </w:pPr>
-            <w:hyperlink r:id="rId327">
+            <w:hyperlink r:id="rId336">
               <w:r>
                 <w:rPr>
                   <w:rStyle w:val="Hyperlink"/>
@@ -52226,7 +54646,7 @@
             <w:pPr>
               <w:pStyle w:val="Compact"/>
             </w:pPr>
-            <w:hyperlink r:id="rId328">
+            <w:hyperlink r:id="rId337">
               <w:r>
                 <w:rPr>
                   <w:rStyle w:val="Hyperlink"/>
@@ -52310,7 +54730,7 @@
             <w:pPr>
               <w:pStyle w:val="Compact"/>
             </w:pPr>
-            <w:hyperlink r:id="rId329">
+            <w:hyperlink r:id="rId338">
               <w:r>
                 <w:rPr>
                   <w:rStyle w:val="Hyperlink"/>
@@ -52394,7 +54814,7 @@
             <w:pPr>
               <w:pStyle w:val="Compact"/>
             </w:pPr>
-            <w:hyperlink r:id="rId330">
+            <w:hyperlink r:id="rId339">
               <w:r>
                 <w:rPr>
                   <w:rStyle w:val="Hyperlink"/>
@@ -52478,7 +54898,7 @@
             <w:pPr>
               <w:pStyle w:val="Compact"/>
             </w:pPr>
-            <w:hyperlink r:id="rId331">
+            <w:hyperlink r:id="rId340">
               <w:r>
                 <w:rPr>
                   <w:rStyle w:val="Hyperlink"/>
@@ -52562,7 +54982,7 @@
             <w:pPr>
               <w:pStyle w:val="Compact"/>
             </w:pPr>
-            <w:hyperlink r:id="rId332">
+            <w:hyperlink r:id="rId341">
               <w:r>
                 <w:rPr>
                   <w:rStyle w:val="Hyperlink"/>
@@ -52640,8 +55060,8 @@
         </w:tc>
       </w:tr>
     </w:tbl>
-    <w:bookmarkEnd w:id="333"/>
-    <w:bookmarkStart w:id="334" w:name="einridecan-go-deep-dive"/>
+    <w:bookmarkEnd w:id="342"/>
+    <w:bookmarkStart w:id="343" w:name="einridecan-go-deep-dive"/>
     <w:p>
       <w:pPr>
         <w:pStyle w:val="Heading3"/>
@@ -53349,8 +55769,8 @@
         <w:t xml:space="preserve">- 31 releases, v0.17.0 as of Feb 2026</w:t>
       </w:r>
     </w:p>
-    <w:bookmarkEnd w:id="334"/>
-    <w:bookmarkStart w:id="337" w:name="nmea-2000-from-go"/>
+    <w:bookmarkEnd w:id="343"/>
+    <w:bookmarkStart w:id="346" w:name="nmea-2000-from-go"/>
     <w:p>
       <w:pPr>
         <w:pStyle w:val="Heading3"/>
@@ -53498,7 +55918,7 @@
             <w:pPr>
               <w:pStyle w:val="Compact"/>
             </w:pPr>
-            <w:hyperlink r:id="rId335">
+            <w:hyperlink r:id="rId344">
               <w:r>
                 <w:rPr>
                   <w:rStyle w:val="Hyperlink"/>
@@ -53538,7 +55958,7 @@
             <w:pPr>
               <w:pStyle w:val="Compact"/>
             </w:pPr>
-            <w:hyperlink r:id="rId336">
+            <w:hyperlink r:id="rId345">
               <w:r>
                 <w:rPr>
                   <w:rStyle w:val="Hyperlink"/>
@@ -53613,8 +56033,8 @@
         <w:t xml:space="preserve">canboat/canboat (JSON)  → PGN database for custom/proprietary PGN lookup</w:t>
       </w:r>
     </w:p>
-    <w:bookmarkEnd w:id="337"/>
-    <w:bookmarkStart w:id="339" w:name="canboat-integration"/>
+    <w:bookmarkEnd w:id="346"/>
+    <w:bookmarkStart w:id="348" w:name="canboat-integration"/>
     <w:p>
       <w:pPr>
         <w:pStyle w:val="Heading3"/>
@@ -53627,7 +56047,7 @@
       <w:pPr>
         <w:pStyle w:val="FirstParagraph"/>
       </w:pPr>
-      <w:hyperlink r:id="rId338">
+      <w:hyperlink r:id="rId347">
         <w:r>
           <w:rPr>
             <w:rStyle w:val="Hyperlink"/>
@@ -53733,9 +56153,9 @@
         </w:pict>
       </w:r>
     </w:p>
-    <w:bookmarkEnd w:id="339"/>
-    <w:bookmarkEnd w:id="340"/>
-    <w:bookmarkStart w:id="345" w:name="why-can-bus-matters-for-above-deck"/>
+    <w:bookmarkEnd w:id="348"/>
+    <w:bookmarkEnd w:id="349"/>
+    <w:bookmarkStart w:id="354" w:name="why-can-bus-matters-for-above-deck"/>
     <w:p>
       <w:pPr>
         <w:pStyle w:val="Heading2"/>
@@ -53744,7 +56164,7 @@
         <w:t xml:space="preserve">8. Why CAN Bus Matters for Above Deck</w:t>
       </w:r>
     </w:p>
-    <w:bookmarkStart w:id="341" w:name="beyond-marine"/>
+    <w:bookmarkStart w:id="350" w:name="beyond-marine"/>
     <w:p>
       <w:pPr>
         <w:pStyle w:val="Heading3"/>
@@ -54037,8 +56457,8 @@
         <w:t xml:space="preserve">A Go CAN bus library that handles raw frame I/O, protocol decoding, and SocketCAN integration is foundational infrastructure. The application-layer decoders (NMEA 2000, J1939, Victron, BMS) are thin layers on top.</w:t>
       </w:r>
     </w:p>
-    <w:bookmarkEnd w:id="341"/>
-    <w:bookmarkStart w:id="342" w:name="bypassing-node.js"/>
+    <w:bookmarkEnd w:id="350"/>
+    <w:bookmarkStart w:id="351" w:name="bypassing-node.js"/>
     <w:p>
       <w:pPr>
         <w:pStyle w:val="Heading3"/>
@@ -54109,8 +56529,8 @@
         <w:t xml:space="preserve">Fewer moving parts, single binary deployment, lower memory footprint on Raspberry Pi, and no Node.js dependency.</w:t>
       </w:r>
     </w:p>
-    <w:bookmarkEnd w:id="342"/>
-    <w:bookmarkStart w:id="343" w:name="can-fd-future-proofing"/>
+    <w:bookmarkEnd w:id="351"/>
+    <w:bookmarkStart w:id="352" w:name="can-fd-future-proofing"/>
     <w:p>
       <w:pPr>
         <w:pStyle w:val="Heading3"/>
@@ -54135,8 +56555,8 @@
         <w:t xml:space="preserve">By building on einride/can-go (which supports CAN FD) and choosing CAN FD-capable hardware (Waveshare CAN FD HAT, CANable 2.0), Above Deck is ready for next-generation marine buses without architectural changes.</w:t>
       </w:r>
     </w:p>
-    <w:bookmarkEnd w:id="343"/>
-    <w:bookmarkStart w:id="344" w:name="hardware-recommendation-for-development"/>
+    <w:bookmarkEnd w:id="352"/>
+    <w:bookmarkStart w:id="353" w:name="hardware-recommendation-for-development"/>
     <w:p>
       <w:pPr>
         <w:pStyle w:val="Heading3"/>
@@ -54460,9 +56880,9 @@
         </w:pict>
       </w:r>
     </w:p>
-    <w:bookmarkEnd w:id="344"/>
-    <w:bookmarkEnd w:id="345"/>
-    <w:bookmarkStart w:id="346" w:name="glossary"/>
+    <w:bookmarkEnd w:id="353"/>
+    <w:bookmarkEnd w:id="354"/>
+    <w:bookmarkStart w:id="355" w:name="glossary"/>
     <w:p>
       <w:pPr>
         <w:pStyle w:val="Heading2"/>
@@ -55028,8 +57448,8 @@
         </w:pict>
       </w:r>
     </w:p>
-    <w:bookmarkEnd w:id="346"/>
-    <w:bookmarkStart w:id="379" w:name="sources-1"/>
+    <w:bookmarkEnd w:id="355"/>
+    <w:bookmarkStart w:id="388" w:name="sources-1"/>
     <w:p>
       <w:pPr>
         <w:pStyle w:val="Heading2"/>
@@ -55046,7 +57466,7 @@
           <w:numId w:val="1060"/>
         </w:numPr>
       </w:pPr>
-      <w:hyperlink r:id="rId347">
+      <w:hyperlink r:id="rId356">
         <w:r>
           <w:rPr>
             <w:rStyle w:val="Hyperlink"/>
@@ -55063,7 +57483,7 @@
           <w:numId w:val="1060"/>
         </w:numPr>
       </w:pPr>
-      <w:hyperlink r:id="rId348">
+      <w:hyperlink r:id="rId357">
         <w:r>
           <w:rPr>
             <w:rStyle w:val="Hyperlink"/>
@@ -55080,7 +57500,7 @@
           <w:numId w:val="1060"/>
         </w:numPr>
       </w:pPr>
-      <w:hyperlink r:id="rId349">
+      <w:hyperlink r:id="rId358">
         <w:r>
           <w:rPr>
             <w:rStyle w:val="Hyperlink"/>
@@ -55097,7 +57517,7 @@
           <w:numId w:val="1060"/>
         </w:numPr>
       </w:pPr>
-      <w:hyperlink r:id="rId350">
+      <w:hyperlink r:id="rId359">
         <w:r>
           <w:rPr>
             <w:rStyle w:val="Hyperlink"/>
@@ -55114,7 +57534,7 @@
           <w:numId w:val="1060"/>
         </w:numPr>
       </w:pPr>
-      <w:hyperlink r:id="rId351">
+      <w:hyperlink r:id="rId360">
         <w:r>
           <w:rPr>
             <w:rStyle w:val="Hyperlink"/>
@@ -55131,7 +57551,7 @@
           <w:numId w:val="1060"/>
         </w:numPr>
       </w:pPr>
-      <w:hyperlink r:id="rId352">
+      <w:hyperlink r:id="rId361">
         <w:r>
           <w:rPr>
             <w:rStyle w:val="Hyperlink"/>
@@ -55148,7 +57568,7 @@
           <w:numId w:val="1060"/>
         </w:numPr>
       </w:pPr>
-      <w:hyperlink r:id="rId353">
+      <w:hyperlink r:id="rId362">
         <w:r>
           <w:rPr>
             <w:rStyle w:val="Hyperlink"/>
@@ -55165,7 +57585,7 @@
           <w:numId w:val="1060"/>
         </w:numPr>
       </w:pPr>
-      <w:hyperlink r:id="rId354">
+      <w:hyperlink r:id="rId363">
         <w:r>
           <w:rPr>
             <w:rStyle w:val="Hyperlink"/>
@@ -55182,7 +57602,7 @@
           <w:numId w:val="1060"/>
         </w:numPr>
       </w:pPr>
-      <w:hyperlink r:id="rId355">
+      <w:hyperlink r:id="rId364">
         <w:r>
           <w:rPr>
             <w:rStyle w:val="Hyperlink"/>
@@ -55199,7 +57619,7 @@
           <w:numId w:val="1060"/>
         </w:numPr>
       </w:pPr>
-      <w:hyperlink r:id="rId356">
+      <w:hyperlink r:id="rId365">
         <w:r>
           <w:rPr>
             <w:rStyle w:val="Hyperlink"/>
@@ -55216,7 +57636,7 @@
           <w:numId w:val="1060"/>
         </w:numPr>
       </w:pPr>
-      <w:hyperlink r:id="rId357">
+      <w:hyperlink r:id="rId366">
         <w:r>
           <w:rPr>
             <w:rStyle w:val="Hyperlink"/>
@@ -55233,7 +57653,7 @@
           <w:numId w:val="1060"/>
         </w:numPr>
       </w:pPr>
-      <w:hyperlink r:id="rId358">
+      <w:hyperlink r:id="rId367">
         <w:r>
           <w:rPr>
             <w:rStyle w:val="Hyperlink"/>
@@ -55250,7 +57670,7 @@
           <w:numId w:val="1060"/>
         </w:numPr>
       </w:pPr>
-      <w:hyperlink r:id="rId359">
+      <w:hyperlink r:id="rId368">
         <w:r>
           <w:rPr>
             <w:rStyle w:val="Hyperlink"/>
@@ -55267,7 +57687,7 @@
           <w:numId w:val="1060"/>
         </w:numPr>
       </w:pPr>
-      <w:hyperlink r:id="rId360">
+      <w:hyperlink r:id="rId369">
         <w:r>
           <w:rPr>
             <w:rStyle w:val="Hyperlink"/>
@@ -55284,7 +57704,7 @@
           <w:numId w:val="1060"/>
         </w:numPr>
       </w:pPr>
-      <w:hyperlink r:id="rId361">
+      <w:hyperlink r:id="rId370">
         <w:r>
           <w:rPr>
             <w:rStyle w:val="Hyperlink"/>
@@ -55301,7 +57721,7 @@
           <w:numId w:val="1060"/>
         </w:numPr>
       </w:pPr>
-      <w:hyperlink r:id="rId362">
+      <w:hyperlink r:id="rId371">
         <w:r>
           <w:rPr>
             <w:rStyle w:val="Hyperlink"/>
@@ -55318,7 +57738,7 @@
           <w:numId w:val="1060"/>
         </w:numPr>
       </w:pPr>
-      <w:hyperlink r:id="rId363">
+      <w:hyperlink r:id="rId372">
         <w:r>
           <w:rPr>
             <w:rStyle w:val="Hyperlink"/>
@@ -55335,7 +57755,7 @@
           <w:numId w:val="1060"/>
         </w:numPr>
       </w:pPr>
-      <w:hyperlink r:id="rId364">
+      <w:hyperlink r:id="rId373">
         <w:r>
           <w:rPr>
             <w:rStyle w:val="Hyperlink"/>
@@ -55352,7 +57772,7 @@
           <w:numId w:val="1060"/>
         </w:numPr>
       </w:pPr>
-      <w:hyperlink r:id="rId365">
+      <w:hyperlink r:id="rId374">
         <w:r>
           <w:rPr>
             <w:rStyle w:val="Hyperlink"/>
@@ -55369,7 +57789,7 @@
           <w:numId w:val="1060"/>
         </w:numPr>
       </w:pPr>
-      <w:hyperlink r:id="rId327">
+      <w:hyperlink r:id="rId336">
         <w:r>
           <w:rPr>
             <w:rStyle w:val="Hyperlink"/>
@@ -55386,7 +57806,7 @@
           <w:numId w:val="1060"/>
         </w:numPr>
       </w:pPr>
-      <w:hyperlink r:id="rId336">
+      <w:hyperlink r:id="rId345">
         <w:r>
           <w:rPr>
             <w:rStyle w:val="Hyperlink"/>
@@ -55403,7 +57823,7 @@
           <w:numId w:val="1060"/>
         </w:numPr>
       </w:pPr>
-      <w:hyperlink r:id="rId366">
+      <w:hyperlink r:id="rId375">
         <w:r>
           <w:rPr>
             <w:rStyle w:val="Hyperlink"/>
@@ -55420,7 +57840,7 @@
           <w:numId w:val="1060"/>
         </w:numPr>
       </w:pPr>
-      <w:hyperlink r:id="rId338">
+      <w:hyperlink r:id="rId347">
         <w:r>
           <w:rPr>
             <w:rStyle w:val="Hyperlink"/>
@@ -55437,7 +57857,7 @@
           <w:numId w:val="1060"/>
         </w:numPr>
       </w:pPr>
-      <w:hyperlink r:id="rId367">
+      <w:hyperlink r:id="rId376">
         <w:r>
           <w:rPr>
             <w:rStyle w:val="Hyperlink"/>
@@ -55454,7 +57874,7 @@
           <w:numId w:val="1060"/>
         </w:numPr>
       </w:pPr>
-      <w:hyperlink r:id="rId368">
+      <w:hyperlink r:id="rId377">
         <w:r>
           <w:rPr>
             <w:rStyle w:val="Hyperlink"/>
@@ -55471,7 +57891,7 @@
           <w:numId w:val="1060"/>
         </w:numPr>
       </w:pPr>
-      <w:hyperlink r:id="rId369">
+      <w:hyperlink r:id="rId378">
         <w:r>
           <w:rPr>
             <w:rStyle w:val="Hyperlink"/>
@@ -55488,7 +57908,7 @@
           <w:numId w:val="1060"/>
         </w:numPr>
       </w:pPr>
-      <w:hyperlink r:id="rId370">
+      <w:hyperlink r:id="rId379">
         <w:r>
           <w:rPr>
             <w:rStyle w:val="Hyperlink"/>
@@ -55505,7 +57925,7 @@
           <w:numId w:val="1060"/>
         </w:numPr>
       </w:pPr>
-      <w:hyperlink r:id="rId371">
+      <w:hyperlink r:id="rId380">
         <w:r>
           <w:rPr>
             <w:rStyle w:val="Hyperlink"/>
@@ -55522,7 +57942,7 @@
           <w:numId w:val="1060"/>
         </w:numPr>
       </w:pPr>
-      <w:hyperlink r:id="rId372">
+      <w:hyperlink r:id="rId381">
         <w:r>
           <w:rPr>
             <w:rStyle w:val="Hyperlink"/>
@@ -55539,7 +57959,7 @@
           <w:numId w:val="1060"/>
         </w:numPr>
       </w:pPr>
-      <w:hyperlink r:id="rId373">
+      <w:hyperlink r:id="rId382">
         <w:r>
           <w:rPr>
             <w:rStyle w:val="Hyperlink"/>
@@ -55556,7 +57976,7 @@
           <w:numId w:val="1060"/>
         </w:numPr>
       </w:pPr>
-      <w:hyperlink r:id="rId374">
+      <w:hyperlink r:id="rId383">
         <w:r>
           <w:rPr>
             <w:rStyle w:val="Hyperlink"/>
@@ -55573,7 +57993,7 @@
           <w:numId w:val="1060"/>
         </w:numPr>
       </w:pPr>
-      <w:hyperlink r:id="rId375">
+      <w:hyperlink r:id="rId384">
         <w:r>
           <w:rPr>
             <w:rStyle w:val="Hyperlink"/>
@@ -55590,7 +58010,7 @@
           <w:numId w:val="1060"/>
         </w:numPr>
       </w:pPr>
-      <w:hyperlink r:id="rId376">
+      <w:hyperlink r:id="rId385">
         <w:r>
           <w:rPr>
             <w:rStyle w:val="Hyperlink"/>
@@ -55607,7 +58027,7 @@
           <w:numId w:val="1060"/>
         </w:numPr>
       </w:pPr>
-      <w:hyperlink r:id="rId377">
+      <w:hyperlink r:id="rId386">
         <w:r>
           <w:rPr>
             <w:rStyle w:val="Hyperlink"/>
@@ -55624,7 +58044,7 @@
           <w:numId w:val="1060"/>
         </w:numPr>
       </w:pPr>
-      <w:hyperlink r:id="rId378">
+      <w:hyperlink r:id="rId387">
         <w:r>
           <w:rPr>
             <w:rStyle w:val="Hyperlink"/>
@@ -55640,9 +58060,9 @@
         </w:pict>
       </w:r>
     </w:p>
-    <w:bookmarkEnd w:id="379"/>
-    <w:bookmarkEnd w:id="380"/>
-    <w:bookmarkStart w:id="381" w:name="appendix-b-smart-home-pwa-integration"/>
+    <w:bookmarkEnd w:id="388"/>
+    <w:bookmarkEnd w:id="389"/>
+    <w:bookmarkStart w:id="390" w:name="appendix-b-smart-home-pwa-integration"/>
     <w:p>
       <w:pPr>
         <w:pStyle w:val="Heading1"/>
@@ -55651,8 +58071,8 @@
         <w:t xml:space="preserve">Appendix B: Smart Home &amp; PWA Integration</w:t>
       </w:r>
     </w:p>
-    <w:bookmarkEnd w:id="381"/>
-    <w:bookmarkStart w:id="492" w:name="X95b3853c1fcb8764022cd5d9601de2ab41bd6dc"/>
+    <w:bookmarkEnd w:id="390"/>
+    <w:bookmarkStart w:id="501" w:name="X95b3853c1fcb8764022cd5d9601de2ab41bd6dc"/>
     <w:p>
       <w:pPr>
         <w:pStyle w:val="Heading1"/>
@@ -55707,7 +58127,7 @@
       <w:r>
         <w:t xml:space="preserve"> </w:t>
       </w:r>
-      <w:hyperlink r:id="rId382">
+      <w:hyperlink r:id="rId391">
         <w:r>
           <w:rPr>
             <w:rStyle w:val="Hyperlink"/>
@@ -55721,7 +58141,7 @@
       <w:r>
         <w:t xml:space="preserve"> </w:t>
       </w:r>
-      <w:hyperlink r:id="rId383">
+      <w:hyperlink r:id="rId392">
         <w:r>
           <w:rPr>
             <w:rStyle w:val="Hyperlink"/>
@@ -55735,7 +58155,7 @@
       <w:r>
         <w:t xml:space="preserve"> </w:t>
       </w:r>
-      <w:hyperlink r:id="rId384">
+      <w:hyperlink r:id="rId393">
         <w:r>
           <w:rPr>
             <w:rStyle w:val="Hyperlink"/>
@@ -55751,7 +58171,7 @@
         </w:pict>
       </w:r>
     </w:p>
-    <w:bookmarkStart w:id="385" w:name="executive-summary-5"/>
+    <w:bookmarkStart w:id="394" w:name="executive-summary-5"/>
     <w:p>
       <w:pPr>
         <w:pStyle w:val="Heading2"/>
@@ -55791,8 +58211,8 @@
         </w:pict>
       </w:r>
     </w:p>
-    <w:bookmarkEnd w:id="385"/>
-    <w:bookmarkStart w:id="391" w:name="part-1-smart-home-ecosystem-overview"/>
+    <w:bookmarkEnd w:id="394"/>
+    <w:bookmarkStart w:id="400" w:name="part-1-smart-home-ecosystem-overview"/>
     <w:p>
       <w:pPr>
         <w:pStyle w:val="Heading2"/>
@@ -55801,7 +58221,7 @@
         <w:t xml:space="preserve">Part 1: Smart Home Ecosystem Overview</w:t>
       </w:r>
     </w:p>
-    <w:bookmarkStart w:id="386" w:name="apple-homekit-home-app"/>
+    <w:bookmarkStart w:id="395" w:name="apple-homekit-home-app"/>
     <w:p>
       <w:pPr>
         <w:pStyle w:val="Heading3"/>
@@ -56174,8 +58594,8 @@
         </w:tc>
       </w:tr>
     </w:tbl>
-    <w:bookmarkEnd w:id="386"/>
-    <w:bookmarkStart w:id="387" w:name="google-home"/>
+    <w:bookmarkEnd w:id="395"/>
+    <w:bookmarkStart w:id="396" w:name="google-home"/>
     <w:p>
       <w:pPr>
         <w:pStyle w:val="Heading3"/>
@@ -56534,8 +58954,8 @@
         </w:tc>
       </w:tr>
     </w:tbl>
-    <w:bookmarkEnd w:id="387"/>
-    <w:bookmarkStart w:id="388" w:name="amazon-alexa"/>
+    <w:bookmarkEnd w:id="396"/>
+    <w:bookmarkStart w:id="397" w:name="amazon-alexa"/>
     <w:p>
       <w:pPr>
         <w:pStyle w:val="Heading3"/>
@@ -56872,8 +59292,8 @@
         </w:tc>
       </w:tr>
     </w:tbl>
-    <w:bookmarkEnd w:id="388"/>
-    <w:bookmarkStart w:id="389" w:name="samsung-smartthings"/>
+    <w:bookmarkEnd w:id="397"/>
+    <w:bookmarkStart w:id="398" w:name="samsung-smartthings"/>
     <w:p>
       <w:pPr>
         <w:pStyle w:val="Heading3"/>
@@ -57102,8 +59522,8 @@
         </w:tc>
       </w:tr>
     </w:tbl>
-    <w:bookmarkEnd w:id="389"/>
-    <w:bookmarkStart w:id="390" w:name="home-assistant"/>
+    <w:bookmarkEnd w:id="398"/>
+    <w:bookmarkStart w:id="399" w:name="home-assistant"/>
     <w:p>
       <w:pPr>
         <w:pStyle w:val="Heading3"/>
@@ -57485,9 +59905,9 @@
         </w:pict>
       </w:r>
     </w:p>
-    <w:bookmarkEnd w:id="390"/>
-    <w:bookmarkEnd w:id="391"/>
-    <w:bookmarkStart w:id="400" w:name="part-2-homekit-deep-dive"/>
+    <w:bookmarkEnd w:id="399"/>
+    <w:bookmarkEnd w:id="400"/>
+    <w:bookmarkStart w:id="409" w:name="part-2-homekit-deep-dive"/>
     <w:p>
       <w:pPr>
         <w:pStyle w:val="Heading2"/>
@@ -57496,7 +59916,7 @@
         <w:t xml:space="preserve">Part 2: HomeKit Deep Dive</w:t>
       </w:r>
     </w:p>
-    <w:bookmarkStart w:id="392" w:name="homekit-accessory-protocol-hap"/>
+    <w:bookmarkStart w:id="401" w:name="homekit-accessory-protocol-hap"/>
     <w:p>
       <w:pPr>
         <w:pStyle w:val="Heading3"/>
@@ -57671,8 +60091,8 @@
         <w:t xml:space="preserve">        └── Characteristic: Firmware Revision</w:t>
       </w:r>
     </w:p>
-    <w:bookmarkEnd w:id="392"/>
-    <w:bookmarkStart w:id="393" w:name="homekit-over-ip-vs-homekit-over-ble"/>
+    <w:bookmarkEnd w:id="401"/>
+    <w:bookmarkStart w:id="402" w:name="homekit-over-ip-vs-homekit-over-ble"/>
     <w:p>
       <w:pPr>
         <w:pStyle w:val="Heading3"/>
@@ -57984,8 +60404,8 @@
         </w:tc>
       </w:tr>
     </w:tbl>
-    <w:bookmarkEnd w:id="393"/>
-    <w:bookmarkStart w:id="394" w:name="homekit-bridges"/>
+    <w:bookmarkEnd w:id="402"/>
+    <w:bookmarkStart w:id="403" w:name="homekit-bridges"/>
     <w:p>
       <w:pPr>
         <w:pStyle w:val="Heading3"/>
@@ -58277,8 +60697,8 @@
         </w:tc>
       </w:tr>
     </w:tbl>
-    <w:bookmarkEnd w:id="394"/>
-    <w:bookmarkStart w:id="395" w:name="homekit-matter"/>
+    <w:bookmarkEnd w:id="403"/>
+    <w:bookmarkStart w:id="404" w:name="homekit-matter"/>
     <w:p>
       <w:pPr>
         <w:pStyle w:val="Heading3"/>
@@ -58313,8 +60733,8 @@
         <w:t xml:space="preserve">If the Go server exposes boat systems as Matter devices, they will appear in HomeKit without implementing HAP at all. Matter is the recommended path — it gets HomeKit support for free alongside Google Home and Alexa.</w:t>
       </w:r>
     </w:p>
-    <w:bookmarkEnd w:id="395"/>
-    <w:bookmarkStart w:id="396" w:name="can-a-web-app-pwa-interact-with-homekit"/>
+    <w:bookmarkEnd w:id="404"/>
+    <w:bookmarkStart w:id="405" w:name="can-a-web-app-pwa-interact-with-homekit"/>
     <w:p>
       <w:pPr>
         <w:pStyle w:val="Heading3"/>
@@ -58387,8 +60807,8 @@
         <w:t xml:space="preserve">The only way a web-based application can influence HomeKit is indirectly — by controlling a server that acts as a HomeKit bridge.</w:t>
       </w:r>
     </w:p>
-    <w:bookmarkEnd w:id="396"/>
-    <w:bookmarkStart w:id="397" w:name="hap-nodejs-and-homebridge"/>
+    <w:bookmarkEnd w:id="405"/>
+    <w:bookmarkStart w:id="406" w:name="hap-nodejs-and-homebridge"/>
     <w:p>
       <w:pPr>
         <w:pStyle w:val="Heading3"/>
@@ -58451,8 +60871,8 @@
         <w:t xml:space="preserve">Homebridge proves the bridge pattern works. A server on the boat network can make any data source appear in HomeKit. However, Homebridge is Node.js — which conflicts with Above Deck’s Go-only backend principle.</w:t>
       </w:r>
     </w:p>
-    <w:bookmarkEnd w:id="397"/>
-    <w:bookmarkStart w:id="399" w:name="hap-in-go-brutellahap"/>
+    <w:bookmarkEnd w:id="406"/>
+    <w:bookmarkStart w:id="408" w:name="hap-in-go-brutellahap"/>
     <w:p>
       <w:pPr>
         <w:pStyle w:val="Heading3"/>
@@ -58471,7 +60891,7 @@
       <w:r>
         <w:t xml:space="preserve"> </w:t>
       </w:r>
-      <w:hyperlink r:id="rId398">
+      <w:hyperlink r:id="rId407">
         <w:r>
           <w:rPr>
             <w:rStyle w:val="Hyperlink"/>
@@ -58944,9 +61364,9 @@
         </w:pict>
       </w:r>
     </w:p>
-    <w:bookmarkEnd w:id="399"/>
-    <w:bookmarkEnd w:id="400"/>
-    <w:bookmarkStart w:id="405" w:name="part-3-matter-as-the-universal-bridge"/>
+    <w:bookmarkEnd w:id="408"/>
+    <w:bookmarkEnd w:id="409"/>
+    <w:bookmarkStart w:id="414" w:name="part-3-matter-as-the-universal-bridge"/>
     <w:p>
       <w:pPr>
         <w:pStyle w:val="Heading2"/>
@@ -58955,7 +61375,7 @@
         <w:t xml:space="preserve">Part 3: Matter as the Universal Bridge</w:t>
       </w:r>
     </w:p>
-    <w:bookmarkStart w:id="401" w:name="one-implementation-all-ecosystems"/>
+    <w:bookmarkStart w:id="410" w:name="one-implementation-all-ecosystems"/>
     <w:p>
       <w:pPr>
         <w:pStyle w:val="Heading3"/>
@@ -59045,8 +61465,8 @@
         <w:t xml:space="preserve">All five controllers see the same boat devices. One implementation in Go, five ecosystems served.</w:t>
       </w:r>
     </w:p>
-    <w:bookmarkEnd w:id="401"/>
-    <w:bookmarkStart w:id="402" w:name="multi-admin-how-it-works"/>
+    <w:bookmarkEnd w:id="410"/>
+    <w:bookmarkStart w:id="411" w:name="multi-admin-how-it-works"/>
     <w:p>
       <w:pPr>
         <w:pStyle w:val="Heading3"/>
@@ -59127,8 +61547,8 @@
         <w:t xml:space="preserve">The Matter standard guarantees at least five concurrent fabric memberships</w:t>
       </w:r>
     </w:p>
-    <w:bookmarkEnd w:id="402"/>
-    <w:bookmarkStart w:id="403" w:name="X9f591dc848f0e31569660c70e789b57ed5f281b"/>
+    <w:bookmarkEnd w:id="411"/>
+    <w:bookmarkStart w:id="412" w:name="X9f591dc848f0e31569660c70e789b57ed5f281b"/>
     <w:p>
       <w:pPr>
         <w:pStyle w:val="Heading3"/>
@@ -59805,8 +62225,8 @@
         </w:tc>
       </w:tr>
     </w:tbl>
-    <w:bookmarkEnd w:id="403"/>
-    <w:bookmarkStart w:id="404" w:name="the-bridge-architecture"/>
+    <w:bookmarkEnd w:id="412"/>
+    <w:bookmarkStart w:id="413" w:name="the-bridge-architecture"/>
     <w:p>
       <w:pPr>
         <w:pStyle w:val="Heading3"/>
@@ -60297,9 +62717,9 @@
         </w:pict>
       </w:r>
     </w:p>
-    <w:bookmarkEnd w:id="404"/>
-    <w:bookmarkEnd w:id="405"/>
-    <w:bookmarkStart w:id="413" w:name="part-4-pwa-limitations-with-smart-home"/>
+    <w:bookmarkEnd w:id="413"/>
+    <w:bookmarkEnd w:id="414"/>
+    <w:bookmarkStart w:id="422" w:name="part-4-pwa-limitations-with-smart-home"/>
     <w:p>
       <w:pPr>
         <w:pStyle w:val="Heading2"/>
@@ -60308,7 +62728,7 @@
         <w:t xml:space="preserve">Part 4: PWA Limitations with Smart Home</w:t>
       </w:r>
     </w:p>
-    <w:bookmarkStart w:id="406" w:name="what-a-pwa-cannot-do"/>
+    <w:bookmarkStart w:id="415" w:name="what-a-pwa-cannot-do"/>
     <w:p>
       <w:pPr>
         <w:pStyle w:val="Heading3"/>
@@ -60665,8 +63085,8 @@
         </w:tc>
       </w:tr>
     </w:tbl>
-    <w:bookmarkEnd w:id="406"/>
-    <w:bookmarkStart w:id="407" w:name="X4f8a8f1a25dd7ce9ba56a56b7328209a417d14e"/>
+    <w:bookmarkEnd w:id="415"/>
+    <w:bookmarkStart w:id="416" w:name="X4f8a8f1a25dd7ce9ba56a56b7328209a417d14e"/>
     <w:p>
       <w:pPr>
         <w:pStyle w:val="Heading3"/>
@@ -60785,8 +63205,8 @@
         <w:t xml:space="preserve">— HomeKit (iOS), Google Home SDK (Android), and Alexa SDK are native-only frameworks.</w:t>
       </w:r>
     </w:p>
-    <w:bookmarkEnd w:id="407"/>
-    <w:bookmarkStart w:id="412" w:name="workarounds-that-do-work"/>
+    <w:bookmarkEnd w:id="416"/>
+    <w:bookmarkStart w:id="421" w:name="workarounds-that-do-work"/>
     <w:p>
       <w:pPr>
         <w:pStyle w:val="Heading3"/>
@@ -60795,7 +63215,7 @@
         <w:t xml:space="preserve">Workarounds That Do Work</w:t>
       </w:r>
     </w:p>
-    <w:bookmarkStart w:id="408" w:name="X973e28055a6952ca33b09e67a4dc30687559735"/>
+    <w:bookmarkStart w:id="417" w:name="X973e28055a6952ca33b09e67a4dc30687559735"/>
     <w:p>
       <w:pPr>
         <w:pStyle w:val="Heading4"/>
@@ -60859,8 +63279,8 @@
         <w:t xml:space="preserve">- One codebase, two access paths (PWA + smart home apps)</w:t>
       </w:r>
     </w:p>
-    <w:bookmarkEnd w:id="408"/>
-    <w:bookmarkStart w:id="409" w:name="X680b830a5ec3315106d279306da20a959667c3f"/>
+    <w:bookmarkEnd w:id="417"/>
+    <w:bookmarkStart w:id="418" w:name="X680b830a5ec3315106d279306da20a959667c3f"/>
     <w:p>
       <w:pPr>
         <w:pStyle w:val="Heading4"/>
@@ -60979,8 +63399,8 @@
         <w:t xml:space="preserve">However, this requires building and maintaining a custom Capacitor plugin that wraps Apple’s HomeKit framework. It also only covers Apple — not Google Home or Alexa. This is a lower priority than the Matter bridge approach.</w:t>
       </w:r>
     </w:p>
-    <w:bookmarkEnd w:id="409"/>
-    <w:bookmarkStart w:id="410" w:name="google-home-rest-api-cloud-based"/>
+    <w:bookmarkEnd w:id="418"/>
+    <w:bookmarkStart w:id="419" w:name="google-home-rest-api-cloud-based"/>
     <w:p>
       <w:pPr>
         <w:pStyle w:val="Heading4"/>
@@ -61029,8 +63449,8 @@
         <w:t xml:space="preserve">Not recommended for Above Deck. Matter local control is superior.</w:t>
       </w:r>
     </w:p>
-    <w:bookmarkEnd w:id="410"/>
-    <w:bookmarkStart w:id="411" w:name="home-assistant-as-middleware"/>
+    <w:bookmarkEnd w:id="419"/>
+    <w:bookmarkStart w:id="420" w:name="home-assistant-as-middleware"/>
     <w:p>
       <w:pPr>
         <w:pStyle w:val="Heading4"/>
@@ -61054,10 +63474,10 @@
         </w:pict>
       </w:r>
     </w:p>
-    <w:bookmarkEnd w:id="411"/>
-    <w:bookmarkEnd w:id="412"/>
-    <w:bookmarkEnd w:id="413"/>
-    <w:bookmarkStart w:id="418" w:name="part-5-what-can-work-from-a-pwa"/>
+    <w:bookmarkEnd w:id="420"/>
+    <w:bookmarkEnd w:id="421"/>
+    <w:bookmarkEnd w:id="422"/>
+    <w:bookmarkStart w:id="427" w:name="part-5-what-can-work-from-a-pwa"/>
     <w:p>
       <w:pPr>
         <w:pStyle w:val="Heading2"/>
@@ -61074,7 +63494,7 @@
         <w:t xml:space="preserve">Despite the smart home limitations, PWAs retain useful capabilities for the Above Deck use case.</w:t>
       </w:r>
     </w:p>
-    <w:bookmarkStart w:id="414" w:name="web-bluetooth-limited"/>
+    <w:bookmarkStart w:id="423" w:name="web-bluetooth-limited"/>
     <w:p>
       <w:pPr>
         <w:pStyle w:val="Heading3"/>
@@ -61299,8 +63719,8 @@
         <w:t xml:space="preserve">On Android, the PWA could directly read BLE sensors (Victron, temperature) without the Go server. Not viable on iOS — the primary tablet platform.</w:t>
       </w:r>
     </w:p>
-    <w:bookmarkEnd w:id="414"/>
-    <w:bookmarkStart w:id="415" w:name="websocket-to-local-server"/>
+    <w:bookmarkEnd w:id="423"/>
+    <w:bookmarkStart w:id="424" w:name="websocket-to-local-server"/>
     <w:p>
       <w:pPr>
         <w:pStyle w:val="Heading3"/>
@@ -61376,8 +63796,8 @@
         <w:t xml:space="preserve">Works offline (local network, no internet needed)</w:t>
       </w:r>
     </w:p>
-    <w:bookmarkEnd w:id="415"/>
-    <w:bookmarkStart w:id="416" w:name="push-notifications"/>
+    <w:bookmarkEnd w:id="424"/>
+    <w:bookmarkStart w:id="425" w:name="push-notifications"/>
     <w:p>
       <w:pPr>
         <w:pStyle w:val="Heading3"/>
@@ -61567,8 +63987,8 @@
         <w:t xml:space="preserve">Alert when boat alarm triggers (bilge pump, anchor drag, battery low). The Go server sends a push notification via web push protocol. Works even when the PWA is not actively open (on Android; limited on iOS).</w:t>
       </w:r>
     </w:p>
-    <w:bookmarkEnd w:id="416"/>
-    <w:bookmarkStart w:id="417" w:name="service-worker-background-processing"/>
+    <w:bookmarkEnd w:id="425"/>
+    <w:bookmarkStart w:id="426" w:name="service-worker-background-processing"/>
     <w:p>
       <w:pPr>
         <w:pStyle w:val="Heading3"/>
@@ -61666,9 +64086,9 @@
         </w:pict>
       </w:r>
     </w:p>
-    <w:bookmarkEnd w:id="417"/>
-    <w:bookmarkEnd w:id="418"/>
-    <w:bookmarkStart w:id="422" w:name="Xc41a927527e65258f7e9a958d4d72d6d5404713"/>
+    <w:bookmarkEnd w:id="426"/>
+    <w:bookmarkEnd w:id="427"/>
+    <w:bookmarkStart w:id="431" w:name="Xc41a927527e65258f7e9a958d4d72d6d5404713"/>
     <w:p>
       <w:pPr>
         <w:pStyle w:val="Heading2"/>
@@ -61677,7 +64097,7 @@
         <w:t xml:space="preserve">Part 6: Homebridge / HAP-NodeJS Pattern Analysis</w:t>
       </w:r>
     </w:p>
-    <w:bookmarkStart w:id="419" w:name="how-homebridge-works"/>
+    <w:bookmarkStart w:id="428" w:name="how-homebridge-works"/>
     <w:p>
       <w:pPr>
         <w:pStyle w:val="Heading3"/>
@@ -61988,8 +64408,8 @@
         <w:t xml:space="preserve">Plugins translate between HomeKit and the actual device API</w:t>
       </w:r>
     </w:p>
-    <w:bookmarkEnd w:id="419"/>
-    <w:bookmarkStart w:id="420" w:name="Xf5db25b96851201e5ebc2009046e1c20ce0d838"/>
+    <w:bookmarkEnd w:id="428"/>
+    <w:bookmarkStart w:id="429" w:name="Xf5db25b96851201e5ebc2009046e1c20ce0d838"/>
     <w:p>
       <w:pPr>
         <w:pStyle w:val="Heading3"/>
@@ -62482,8 +64902,8 @@
         <w:t xml:space="preserve">This would make cabin temperature appear in Apple Home. But it only covers HomeKit — not Google Home or Alexa. The same effort invested in a Matter bridge covers all three.</w:t>
       </w:r>
     </w:p>
-    <w:bookmarkEnd w:id="420"/>
-    <w:bookmarkStart w:id="421" w:name="recommendation-matter-over-hap"/>
+    <w:bookmarkEnd w:id="429"/>
+    <w:bookmarkStart w:id="430" w:name="recommendation-matter-over-hap"/>
     <w:p>
       <w:pPr>
         <w:pStyle w:val="Heading3"/>
@@ -62785,9 +65205,9 @@
         </w:pict>
       </w:r>
     </w:p>
-    <w:bookmarkEnd w:id="421"/>
-    <w:bookmarkEnd w:id="422"/>
-    <w:bookmarkStart w:id="427" w:name="part-7-home-assistant-integration"/>
+    <w:bookmarkEnd w:id="430"/>
+    <w:bookmarkEnd w:id="431"/>
+    <w:bookmarkStart w:id="436" w:name="part-7-home-assistant-integration"/>
     <w:p>
       <w:pPr>
         <w:pStyle w:val="Heading2"/>
@@ -62796,7 +65216,7 @@
         <w:t xml:space="preserve">Part 7: Home Assistant Integration</w:t>
       </w:r>
     </w:p>
-    <w:bookmarkStart w:id="423" w:name="home-assistant-as-an-alternative-hub"/>
+    <w:bookmarkStart w:id="432" w:name="home-assistant-as-an-alternative-hub"/>
     <w:p>
       <w:pPr>
         <w:pStyle w:val="Heading3"/>
@@ -62813,8 +65233,8 @@
         <w:t xml:space="preserve">Many sailors already run Home Assistant (often on the same Raspberry Pi as SignalK). For these users, Above Deck should integrate with HA rather than replace it.</w:t>
       </w:r>
     </w:p>
-    <w:bookmarkEnd w:id="423"/>
-    <w:bookmarkStart w:id="424" w:name="integration-architecture-mqtt-bridge"/>
+    <w:bookmarkEnd w:id="432"/>
+    <w:bookmarkStart w:id="433" w:name="integration-architecture-mqtt-bridge"/>
     <w:p>
       <w:pPr>
         <w:pStyle w:val="Heading3"/>
@@ -63005,8 +65425,8 @@
         <w:t xml:space="preserve">topics, HA will automatically create entities for all boat systems — zero manual configuration for the sailor.</w:t>
       </w:r>
     </w:p>
-    <w:bookmarkEnd w:id="424"/>
-    <w:bookmarkStart w:id="425" w:name="bbn-os-precedent"/>
+    <w:bookmarkEnd w:id="433"/>
+    <w:bookmarkStart w:id="434" w:name="bbn-os-precedent"/>
     <w:p>
       <w:pPr>
         <w:pStyle w:val="Heading3"/>
@@ -63109,8 +65529,8 @@
         <w:t xml:space="preserve">- Exposing a richer data set (Matter sensors + NMEA + Victron in one stream)</w:t>
       </w:r>
     </w:p>
-    <w:bookmarkEnd w:id="425"/>
-    <w:bookmarkStart w:id="426" w:name="matterbridge"/>
+    <w:bookmarkEnd w:id="434"/>
+    <w:bookmarkStart w:id="435" w:name="matterbridge"/>
     <w:p>
       <w:pPr>
         <w:pStyle w:val="Heading3"/>
@@ -63171,9 +65591,9 @@
         </w:pict>
       </w:r>
     </w:p>
-    <w:bookmarkEnd w:id="426"/>
-    <w:bookmarkEnd w:id="427"/>
-    <w:bookmarkStart w:id="431" w:name="part-8-voice-control-opportunities"/>
+    <w:bookmarkEnd w:id="435"/>
+    <w:bookmarkEnd w:id="436"/>
+    <w:bookmarkStart w:id="440" w:name="part-8-voice-control-opportunities"/>
     <w:p>
       <w:pPr>
         <w:pStyle w:val="Heading2"/>
@@ -63182,7 +65602,7 @@
         <w:t xml:space="preserve">Part 8: Voice Control Opportunities</w:t>
       </w:r>
     </w:p>
-    <w:bookmarkStart w:id="428" w:name="X31215b26b8ed5a17a57a2acb955aa1a6446879a"/>
+    <w:bookmarkStart w:id="437" w:name="X31215b26b8ed5a17a57a2acb955aa1a6446879a"/>
     <w:p>
       <w:pPr>
         <w:pStyle w:val="Heading3"/>
@@ -63425,8 +65845,8 @@
         <w:t xml:space="preserve">A smart home hub device on the boat’s local network, and internet connectivity for cloud-based voice processing (Siri, Google, Alexa all require internet for speech recognition).</w:t>
       </w:r>
     </w:p>
-    <w:bookmarkEnd w:id="428"/>
-    <w:bookmarkStart w:id="429" w:name="offline-voice-the-d3kos-approach"/>
+    <w:bookmarkEnd w:id="437"/>
+    <w:bookmarkStart w:id="438" w:name="offline-voice-the-d3kos-approach"/>
     <w:p>
       <w:pPr>
         <w:pStyle w:val="Heading3"/>
@@ -63517,8 +65937,8 @@
         <w:t xml:space="preserve">~2-3 seconds from wake word to spoken response. All processing on a Raspberry Pi 4, no internet required.</w:t>
       </w:r>
     </w:p>
-    <w:bookmarkEnd w:id="429"/>
-    <w:bookmarkStart w:id="430" w:name="which-approach-is-better-for-boats"/>
+    <w:bookmarkEnd w:id="438"/>
+    <w:bookmarkStart w:id="439" w:name="which-approach-is-better-for-boats"/>
     <w:p>
       <w:pPr>
         <w:pStyle w:val="Heading3"/>
@@ -64005,9 +66425,9 @@
         </w:pict>
       </w:r>
     </w:p>
-    <w:bookmarkEnd w:id="430"/>
-    <w:bookmarkEnd w:id="431"/>
-    <w:bookmarkStart w:id="438" w:name="part-9-recommendations-for-above-deck"/>
+    <w:bookmarkEnd w:id="439"/>
+    <w:bookmarkEnd w:id="440"/>
+    <w:bookmarkStart w:id="447" w:name="part-9-recommendations-for-above-deck"/>
     <w:p>
       <w:pPr>
         <w:pStyle w:val="Heading2"/>
@@ -64016,7 +66436,7 @@
         <w:t xml:space="preserve">Part 9: Recommendations for Above Deck</w:t>
       </w:r>
     </w:p>
-    <w:bookmarkStart w:id="432" w:name="priority-1-matter-bridge-in-go-server"/>
+    <w:bookmarkStart w:id="441" w:name="priority-1-matter-bridge-in-go-server"/>
     <w:p>
       <w:pPr>
         <w:pStyle w:val="Heading3"/>
@@ -64147,7 +66567,7 @@
       <w:r>
         <w:t xml:space="preserve"> </w:t>
       </w:r>
-      <w:hyperlink r:id="rId382">
+      <w:hyperlink r:id="rId391">
         <w:r>
           <w:rPr>
             <w:rStyle w:val="Hyperlink"/>
@@ -64162,8 +66582,8 @@
         <w:t xml:space="preserve">for detailed breakdown).</w:t>
       </w:r>
     </w:p>
-    <w:bookmarkEnd w:id="432"/>
-    <w:bookmarkStart w:id="433" w:name="Xb147e59f476305d66e243e7296f50d95438c6d7"/>
+    <w:bookmarkEnd w:id="441"/>
+    <w:bookmarkStart w:id="442" w:name="Xb147e59f476305d66e243e7296f50d95438c6d7"/>
     <w:p>
       <w:pPr>
         <w:pStyle w:val="Heading3"/>
@@ -64244,8 +66664,8 @@
         <w:t xml:space="preserve">Can ship immediately while Matter bridge is in development. Sailors with Home Assistant get smart home integration from day one.</w:t>
       </w:r>
     </w:p>
-    <w:bookmarkEnd w:id="433"/>
-    <w:bookmarkStart w:id="434" w:name="priority-3-hap-via-brutellahap-fallback"/>
+    <w:bookmarkEnd w:id="442"/>
+    <w:bookmarkStart w:id="443" w:name="priority-3-hap-via-brutellahap-fallback"/>
     <w:p>
       <w:pPr>
         <w:pStyle w:val="Heading3"/>
@@ -64326,8 +66746,8 @@
         <w:t xml:space="preserve">If Matter bridge is more than 6 months away from shipping and users are requesting HomeKit integration.</w:t>
       </w:r>
     </w:p>
-    <w:bookmarkEnd w:id="434"/>
-    <w:bookmarkStart w:id="435" w:name="pwa-strategy-unchanged"/>
+    <w:bookmarkEnd w:id="443"/>
+    <w:bookmarkStart w:id="444" w:name="pwa-strategy-unchanged"/>
     <w:p>
       <w:pPr>
         <w:pStyle w:val="Heading3"/>
@@ -64390,8 +66810,8 @@
         <w:t xml:space="preserve">All paths lead to the same Go server and the same data model. The PWA and smart home ecosystems are parallel access methods, not competing approaches.</w:t>
       </w:r>
     </w:p>
-    <w:bookmarkEnd w:id="435"/>
-    <w:bookmarkStart w:id="436" w:name="implementation-roadmap"/>
+    <w:bookmarkEnd w:id="444"/>
+    <w:bookmarkStart w:id="445" w:name="implementation-roadmap"/>
     <w:p>
       <w:pPr>
         <w:pStyle w:val="Heading3"/>
@@ -64746,8 +67166,8 @@
         </w:tc>
       </w:tr>
     </w:tbl>
-    <w:bookmarkEnd w:id="436"/>
-    <w:bookmarkStart w:id="437" w:name="summary-decision-matrix"/>
+    <w:bookmarkEnd w:id="445"/>
+    <w:bookmarkStart w:id="446" w:name="summary-decision-matrix"/>
     <w:p>
       <w:pPr>
         <w:pStyle w:val="Heading3"/>
@@ -65244,9 +67664,9 @@
         </w:pict>
       </w:r>
     </w:p>
-    <w:bookmarkEnd w:id="437"/>
-    <w:bookmarkEnd w:id="438"/>
-    <w:bookmarkStart w:id="491" w:name="sources-2"/>
+    <w:bookmarkEnd w:id="446"/>
+    <w:bookmarkEnd w:id="447"/>
+    <w:bookmarkStart w:id="500" w:name="sources-2"/>
     <w:p>
       <w:pPr>
         <w:pStyle w:val="Heading2"/>
@@ -65255,7 +67675,7 @@
         <w:t xml:space="preserve">Sources</w:t>
       </w:r>
     </w:p>
-    <w:bookmarkStart w:id="445" w:name="apple-homekit-hap"/>
+    <w:bookmarkStart w:id="454" w:name="apple-homekit-hap"/>
     <w:p>
       <w:pPr>
         <w:pStyle w:val="Heading3"/>
@@ -65272,7 +67692,7 @@
           <w:numId w:val="1070"/>
         </w:numPr>
       </w:pPr>
-      <w:hyperlink r:id="rId439">
+      <w:hyperlink r:id="rId448">
         <w:r>
           <w:rPr>
             <w:rStyle w:val="Hyperlink"/>
@@ -65289,7 +67709,7 @@
           <w:numId w:val="1070"/>
         </w:numPr>
       </w:pPr>
-      <w:hyperlink r:id="rId440">
+      <w:hyperlink r:id="rId449">
         <w:r>
           <w:rPr>
             <w:rStyle w:val="Hyperlink"/>
@@ -65306,7 +67726,7 @@
           <w:numId w:val="1070"/>
         </w:numPr>
       </w:pPr>
-      <w:hyperlink r:id="rId398">
+      <w:hyperlink r:id="rId407">
         <w:r>
           <w:rPr>
             <w:rStyle w:val="Hyperlink"/>
@@ -65323,7 +67743,7 @@
           <w:numId w:val="1070"/>
         </w:numPr>
       </w:pPr>
-      <w:hyperlink r:id="rId441">
+      <w:hyperlink r:id="rId450">
         <w:r>
           <w:rPr>
             <w:rStyle w:val="Hyperlink"/>
@@ -65340,7 +67760,7 @@
           <w:numId w:val="1070"/>
         </w:numPr>
       </w:pPr>
-      <w:hyperlink r:id="rId442">
+      <w:hyperlink r:id="rId451">
         <w:r>
           <w:rPr>
             <w:rStyle w:val="Hyperlink"/>
@@ -65357,7 +67777,7 @@
           <w:numId w:val="1070"/>
         </w:numPr>
       </w:pPr>
-      <w:hyperlink r:id="rId443">
+      <w:hyperlink r:id="rId452">
         <w:r>
           <w:rPr>
             <w:rStyle w:val="Hyperlink"/>
@@ -65374,7 +67794,7 @@
           <w:numId w:val="1070"/>
         </w:numPr>
       </w:pPr>
-      <w:hyperlink r:id="rId444">
+      <w:hyperlink r:id="rId453">
         <w:r>
           <w:rPr>
             <w:rStyle w:val="Hyperlink"/>
@@ -65383,8 +67803,8 @@
         </w:r>
       </w:hyperlink>
     </w:p>
-    <w:bookmarkEnd w:id="445"/>
-    <w:bookmarkStart w:id="452" w:name="google-home-1"/>
+    <w:bookmarkEnd w:id="454"/>
+    <w:bookmarkStart w:id="461" w:name="google-home-1"/>
     <w:p>
       <w:pPr>
         <w:pStyle w:val="Heading3"/>
@@ -65401,7 +67821,7 @@
           <w:numId w:val="1071"/>
         </w:numPr>
       </w:pPr>
-      <w:hyperlink r:id="rId446">
+      <w:hyperlink r:id="rId455">
         <w:r>
           <w:rPr>
             <w:rStyle w:val="Hyperlink"/>
@@ -65418,7 +67838,7 @@
           <w:numId w:val="1071"/>
         </w:numPr>
       </w:pPr>
-      <w:hyperlink r:id="rId447">
+      <w:hyperlink r:id="rId456">
         <w:r>
           <w:rPr>
             <w:rStyle w:val="Hyperlink"/>
@@ -65435,7 +67855,7 @@
           <w:numId w:val="1071"/>
         </w:numPr>
       </w:pPr>
-      <w:hyperlink r:id="rId448">
+      <w:hyperlink r:id="rId457">
         <w:r>
           <w:rPr>
             <w:rStyle w:val="Hyperlink"/>
@@ -65452,7 +67872,7 @@
           <w:numId w:val="1071"/>
         </w:numPr>
       </w:pPr>
-      <w:hyperlink r:id="rId449">
+      <w:hyperlink r:id="rId458">
         <w:r>
           <w:rPr>
             <w:rStyle w:val="Hyperlink"/>
@@ -65469,7 +67889,7 @@
           <w:numId w:val="1071"/>
         </w:numPr>
       </w:pPr>
-      <w:hyperlink r:id="rId450">
+      <w:hyperlink r:id="rId459">
         <w:r>
           <w:rPr>
             <w:rStyle w:val="Hyperlink"/>
@@ -65486,7 +67906,7 @@
           <w:numId w:val="1071"/>
         </w:numPr>
       </w:pPr>
-      <w:hyperlink r:id="rId451">
+      <w:hyperlink r:id="rId460">
         <w:r>
           <w:rPr>
             <w:rStyle w:val="Hyperlink"/>
@@ -65495,8 +67915,8 @@
         </w:r>
       </w:hyperlink>
     </w:p>
-    <w:bookmarkEnd w:id="452"/>
-    <w:bookmarkStart w:id="457" w:name="amazon-alexa-1"/>
+    <w:bookmarkEnd w:id="461"/>
+    <w:bookmarkStart w:id="466" w:name="amazon-alexa-1"/>
     <w:p>
       <w:pPr>
         <w:pStyle w:val="Heading3"/>
@@ -65513,7 +67933,7 @@
           <w:numId w:val="1072"/>
         </w:numPr>
       </w:pPr>
-      <w:hyperlink r:id="rId453">
+      <w:hyperlink r:id="rId462">
         <w:r>
           <w:rPr>
             <w:rStyle w:val="Hyperlink"/>
@@ -65530,7 +67950,7 @@
           <w:numId w:val="1072"/>
         </w:numPr>
       </w:pPr>
-      <w:hyperlink r:id="rId454">
+      <w:hyperlink r:id="rId463">
         <w:r>
           <w:rPr>
             <w:rStyle w:val="Hyperlink"/>
@@ -65547,7 +67967,7 @@
           <w:numId w:val="1072"/>
         </w:numPr>
       </w:pPr>
-      <w:hyperlink r:id="rId455">
+      <w:hyperlink r:id="rId464">
         <w:r>
           <w:rPr>
             <w:rStyle w:val="Hyperlink"/>
@@ -65564,7 +67984,7 @@
           <w:numId w:val="1072"/>
         </w:numPr>
       </w:pPr>
-      <w:hyperlink r:id="rId456">
+      <w:hyperlink r:id="rId465">
         <w:r>
           <w:rPr>
             <w:rStyle w:val="Hyperlink"/>
@@ -65573,8 +67993,8 @@
         </w:r>
       </w:hyperlink>
     </w:p>
-    <w:bookmarkEnd w:id="457"/>
-    <w:bookmarkStart w:id="461" w:name="samsung-smartthings-1"/>
+    <w:bookmarkEnd w:id="466"/>
+    <w:bookmarkStart w:id="470" w:name="samsung-smartthings-1"/>
     <w:p>
       <w:pPr>
         <w:pStyle w:val="Heading3"/>
@@ -65591,7 +68011,7 @@
           <w:numId w:val="1073"/>
         </w:numPr>
       </w:pPr>
-      <w:hyperlink r:id="rId458">
+      <w:hyperlink r:id="rId467">
         <w:r>
           <w:rPr>
             <w:rStyle w:val="Hyperlink"/>
@@ -65608,7 +68028,7 @@
           <w:numId w:val="1073"/>
         </w:numPr>
       </w:pPr>
-      <w:hyperlink r:id="rId459">
+      <w:hyperlink r:id="rId468">
         <w:r>
           <w:rPr>
             <w:rStyle w:val="Hyperlink"/>
@@ -65625,7 +68045,7 @@
           <w:numId w:val="1073"/>
         </w:numPr>
       </w:pPr>
-      <w:hyperlink r:id="rId460">
+      <w:hyperlink r:id="rId469">
         <w:r>
           <w:rPr>
             <w:rStyle w:val="Hyperlink"/>
@@ -65634,8 +68054,8 @@
         </w:r>
       </w:hyperlink>
     </w:p>
-    <w:bookmarkEnd w:id="461"/>
-    <w:bookmarkStart w:id="467" w:name="home-assistant-1"/>
+    <w:bookmarkEnd w:id="470"/>
+    <w:bookmarkStart w:id="476" w:name="home-assistant-1"/>
     <w:p>
       <w:pPr>
         <w:pStyle w:val="Heading3"/>
@@ -65652,7 +68072,7 @@
           <w:numId w:val="1074"/>
         </w:numPr>
       </w:pPr>
-      <w:hyperlink r:id="rId462">
+      <w:hyperlink r:id="rId471">
         <w:r>
           <w:rPr>
             <w:rStyle w:val="Hyperlink"/>
@@ -65669,7 +68089,7 @@
           <w:numId w:val="1074"/>
         </w:numPr>
       </w:pPr>
-      <w:hyperlink r:id="rId463">
+      <w:hyperlink r:id="rId472">
         <w:r>
           <w:rPr>
             <w:rStyle w:val="Hyperlink"/>
@@ -65686,7 +68106,7 @@
           <w:numId w:val="1074"/>
         </w:numPr>
       </w:pPr>
-      <w:hyperlink r:id="rId464">
+      <w:hyperlink r:id="rId473">
         <w:r>
           <w:rPr>
             <w:rStyle w:val="Hyperlink"/>
@@ -65703,7 +68123,7 @@
           <w:numId w:val="1074"/>
         </w:numPr>
       </w:pPr>
-      <w:hyperlink r:id="rId465">
+      <w:hyperlink r:id="rId474">
         <w:r>
           <w:rPr>
             <w:rStyle w:val="Hyperlink"/>
@@ -65720,7 +68140,7 @@
           <w:numId w:val="1074"/>
         </w:numPr>
       </w:pPr>
-      <w:hyperlink r:id="rId466">
+      <w:hyperlink r:id="rId475">
         <w:r>
           <w:rPr>
             <w:rStyle w:val="Hyperlink"/>
@@ -65729,8 +68149,8 @@
         </w:r>
       </w:hyperlink>
     </w:p>
-    <w:bookmarkEnd w:id="467"/>
-    <w:bookmarkStart w:id="472" w:name="matter-protocol"/>
+    <w:bookmarkEnd w:id="476"/>
+    <w:bookmarkStart w:id="481" w:name="matter-protocol"/>
     <w:p>
       <w:pPr>
         <w:pStyle w:val="Heading3"/>
@@ -65747,7 +68167,7 @@
           <w:numId w:val="1075"/>
         </w:numPr>
       </w:pPr>
-      <w:hyperlink r:id="rId468">
+      <w:hyperlink r:id="rId477">
         <w:r>
           <w:rPr>
             <w:rStyle w:val="Hyperlink"/>
@@ -65764,7 +68184,7 @@
           <w:numId w:val="1075"/>
         </w:numPr>
       </w:pPr>
-      <w:hyperlink r:id="rId469">
+      <w:hyperlink r:id="rId478">
         <w:r>
           <w:rPr>
             <w:rStyle w:val="Hyperlink"/>
@@ -65781,7 +68201,7 @@
           <w:numId w:val="1075"/>
         </w:numPr>
       </w:pPr>
-      <w:hyperlink r:id="rId470">
+      <w:hyperlink r:id="rId479">
         <w:r>
           <w:rPr>
             <w:rStyle w:val="Hyperlink"/>
@@ -65798,7 +68218,7 @@
           <w:numId w:val="1075"/>
         </w:numPr>
       </w:pPr>
-      <w:hyperlink r:id="rId471">
+      <w:hyperlink r:id="rId480">
         <w:r>
           <w:rPr>
             <w:rStyle w:val="Hyperlink"/>
@@ -65807,8 +68227,8 @@
         </w:r>
       </w:hyperlink>
     </w:p>
-    <w:bookmarkEnd w:id="472"/>
-    <w:bookmarkStart w:id="476" w:name="matterbridge-1"/>
+    <w:bookmarkEnd w:id="481"/>
+    <w:bookmarkStart w:id="485" w:name="matterbridge-1"/>
     <w:p>
       <w:pPr>
         <w:pStyle w:val="Heading3"/>
@@ -65825,7 +68245,7 @@
           <w:numId w:val="1076"/>
         </w:numPr>
       </w:pPr>
-      <w:hyperlink r:id="rId473">
+      <w:hyperlink r:id="rId482">
         <w:r>
           <w:rPr>
             <w:rStyle w:val="Hyperlink"/>
@@ -65842,7 +68262,7 @@
           <w:numId w:val="1076"/>
         </w:numPr>
       </w:pPr>
-      <w:hyperlink r:id="rId474">
+      <w:hyperlink r:id="rId483">
         <w:r>
           <w:rPr>
             <w:rStyle w:val="Hyperlink"/>
@@ -65859,7 +68279,7 @@
           <w:numId w:val="1076"/>
         </w:numPr>
       </w:pPr>
-      <w:hyperlink r:id="rId475">
+      <w:hyperlink r:id="rId484">
         <w:r>
           <w:rPr>
             <w:rStyle w:val="Hyperlink"/>
@@ -65868,8 +68288,8 @@
         </w:r>
       </w:hyperlink>
     </w:p>
-    <w:bookmarkEnd w:id="476"/>
-    <w:bookmarkStart w:id="481" w:name="marine-bbn-os"/>
+    <w:bookmarkEnd w:id="485"/>
+    <w:bookmarkStart w:id="490" w:name="marine-bbn-os"/>
     <w:p>
       <w:pPr>
         <w:pStyle w:val="Heading3"/>
@@ -65886,7 +68306,7 @@
           <w:numId w:val="1077"/>
         </w:numPr>
       </w:pPr>
-      <w:hyperlink r:id="rId477">
+      <w:hyperlink r:id="rId486">
         <w:r>
           <w:rPr>
             <w:rStyle w:val="Hyperlink"/>
@@ -65903,7 +68323,7 @@
           <w:numId w:val="1077"/>
         </w:numPr>
       </w:pPr>
-      <w:hyperlink r:id="rId478">
+      <w:hyperlink r:id="rId487">
         <w:r>
           <w:rPr>
             <w:rStyle w:val="Hyperlink"/>
@@ -65920,7 +68340,7 @@
           <w:numId w:val="1077"/>
         </w:numPr>
       </w:pPr>
-      <w:hyperlink r:id="rId479">
+      <w:hyperlink r:id="rId488">
         <w:r>
           <w:rPr>
             <w:rStyle w:val="Hyperlink"/>
@@ -65937,7 +68357,7 @@
           <w:numId w:val="1077"/>
         </w:numPr>
       </w:pPr>
-      <w:hyperlink r:id="rId480">
+      <w:hyperlink r:id="rId489">
         <w:r>
           <w:rPr>
             <w:rStyle w:val="Hyperlink"/>
@@ -65946,8 +68366,8 @@
         </w:r>
       </w:hyperlink>
     </w:p>
-    <w:bookmarkEnd w:id="481"/>
-    <w:bookmarkStart w:id="486" w:name="pwa-limitations"/>
+    <w:bookmarkEnd w:id="490"/>
+    <w:bookmarkStart w:id="495" w:name="pwa-limitations"/>
     <w:p>
       <w:pPr>
         <w:pStyle w:val="Heading3"/>
@@ -65964,7 +68384,7 @@
           <w:numId w:val="1078"/>
         </w:numPr>
       </w:pPr>
-      <w:hyperlink r:id="rId482">
+      <w:hyperlink r:id="rId491">
         <w:r>
           <w:rPr>
             <w:rStyle w:val="Hyperlink"/>
@@ -65981,7 +68401,7 @@
           <w:numId w:val="1078"/>
         </w:numPr>
       </w:pPr>
-      <w:hyperlink r:id="rId483">
+      <w:hyperlink r:id="rId492">
         <w:r>
           <w:rPr>
             <w:rStyle w:val="Hyperlink"/>
@@ -65998,7 +68418,7 @@
           <w:numId w:val="1078"/>
         </w:numPr>
       </w:pPr>
-      <w:hyperlink r:id="rId484">
+      <w:hyperlink r:id="rId493">
         <w:r>
           <w:rPr>
             <w:rStyle w:val="Hyperlink"/>
@@ -66015,7 +68435,7 @@
           <w:numId w:val="1078"/>
         </w:numPr>
       </w:pPr>
-      <w:hyperlink r:id="rId485">
+      <w:hyperlink r:id="rId494">
         <w:r>
           <w:rPr>
             <w:rStyle w:val="Hyperlink"/>
@@ -66024,8 +68444,8 @@
         </w:r>
       </w:hyperlink>
     </w:p>
-    <w:bookmarkEnd w:id="486"/>
-    <w:bookmarkStart w:id="490" w:name="voice-offline"/>
+    <w:bookmarkEnd w:id="495"/>
+    <w:bookmarkStart w:id="499" w:name="voice-offline"/>
     <w:p>
       <w:pPr>
         <w:pStyle w:val="Heading3"/>
@@ -66042,7 +68462,7 @@
           <w:numId w:val="1079"/>
         </w:numPr>
       </w:pPr>
-      <w:hyperlink r:id="rId487">
+      <w:hyperlink r:id="rId496">
         <w:r>
           <w:rPr>
             <w:rStyle w:val="Hyperlink"/>
@@ -66059,7 +68479,7 @@
           <w:numId w:val="1079"/>
         </w:numPr>
       </w:pPr>
-      <w:hyperlink r:id="rId488">
+      <w:hyperlink r:id="rId497">
         <w:r>
           <w:rPr>
             <w:rStyle w:val="Hyperlink"/>
@@ -66076,7 +68496,7 @@
           <w:numId w:val="1079"/>
         </w:numPr>
       </w:pPr>
-      <w:hyperlink r:id="rId489">
+      <w:hyperlink r:id="rId498">
         <w:r>
           <w:rPr>
             <w:rStyle w:val="Hyperlink"/>
@@ -66085,9 +68505,9 @@
         </w:r>
       </w:hyperlink>
     </w:p>
-    <w:bookmarkEnd w:id="490"/>
-    <w:bookmarkEnd w:id="491"/>
-    <w:bookmarkEnd w:id="492"/>
+    <w:bookmarkEnd w:id="499"/>
+    <w:bookmarkEnd w:id="500"/>
+    <w:bookmarkEnd w:id="501"/>
     <w:sectPr>
       <w:footnotePr>
         <w:numRestart w:val="eachSect"/>

</xml_diff>